<commit_message>
Complete personal site and Lab05 products.
</commit_message>
<xml_diff>
--- a/lab05/OfficeComputingLabsReport.docx
+++ b/lab05/OfficeComputingLabsReport.docx
@@ -143,6 +143,7 @@
       </w:pPr>
       <w:r>
         <w:rPr>
+          <w:rFonts w:ascii="Times New Roman" w:hAnsi="Times New Roman" w:cs="Times New Roman"/>
           <w:noProof/>
         </w:rPr>
         <w:drawing>
@@ -163,7 +164,7 @@
                     </pic:cNvPicPr>
                   </pic:nvPicPr>
                   <pic:blipFill>
-                    <a:blip r:embed="rId7">
+                    <a:blip r:embed="rId8">
                       <a:extLst>
                         <a:ext uri="{28A0092B-C50C-407E-A947-70E740481C1C}">
                           <a14:useLocalDpi xmlns:a14="http://schemas.microsoft.com/office/drawing/2010/main" val="0"/>
@@ -612,10 +613,11 @@
         </w:rPr>
         <w:fldChar w:fldCharType="separate"/>
       </w:r>
-      <w:hyperlink w:anchor="_Toc241667524" w:history="1">
+      <w:hyperlink w:anchor="_Toc241668987" w:history="1">
         <w:r>
           <w:rPr>
             <w:rStyle w:val="Hyperlink"/>
+            <w:rFonts w:cs="Times New Roman"/>
             <w:noProof/>
           </w:rPr>
           <w:t>Lab</w:t>
@@ -623,6 +625,7 @@
         <w:r>
           <w:rPr>
             <w:rStyle w:val="Hyperlink"/>
+            <w:rFonts w:cs="Times New Roman"/>
             <w:noProof/>
             <w:lang w:val="vi-VN"/>
           </w:rPr>
@@ -631,6 +634,7 @@
         <w:r>
           <w:rPr>
             <w:rStyle w:val="Hyperlink"/>
+            <w:rFonts w:cs="Times New Roman"/>
             <w:noProof/>
           </w:rPr>
           <w:t>02</w:t>
@@ -638,6 +642,7 @@
         <w:r>
           <w:rPr>
             <w:rStyle w:val="Hyperlink"/>
+            <w:rFonts w:cs="Times New Roman"/>
             <w:noProof/>
             <w:lang w:val="vi-VN"/>
           </w:rPr>
@@ -646,6 +651,7 @@
         <w:r>
           <w:rPr>
             <w:rStyle w:val="Hyperlink"/>
+            <w:rFonts w:cs="Times New Roman"/>
             <w:noProof/>
           </w:rPr>
           <w:t xml:space="preserve"> Microsoft Word và Google Docs</w:t>
@@ -669,7 +675,7 @@
             <w:noProof/>
             <w:webHidden/>
           </w:rPr>
-          <w:instrText xml:space="preserve"> PAGEREF _Toc241667524 \h </w:instrText>
+          <w:instrText xml:space="preserve"> PAGEREF _Toc241668987 \h </w:instrText>
         </w:r>
         <w:r>
           <w:rPr>
@@ -704,6 +710,7 @@
       <w:pPr>
         <w:pStyle w:val="TOC2"/>
         <w:tabs>
+          <w:tab w:val="left" w:pos="960"/>
           <w:tab w:val="right" w:leader="dot" w:pos="9061"/>
         </w:tabs>
         <w:rPr>
@@ -715,10 +722,31 @@
           <w14:ligatures w14:val="standardContextual"/>
         </w:rPr>
       </w:pPr>
-      <w:hyperlink w:anchor="_Toc241667525" w:history="1">
+      <w:hyperlink w:anchor="_Toc241668988" w:history="1">
         <w:r>
           <w:rPr>
             <w:rStyle w:val="Hyperlink"/>
+            <w:rFonts w:ascii="Times New Roman" w:hAnsi="Times New Roman" w:cs="Times New Roman"/>
+            <w:noProof/>
+            <w:lang w:val="vi-VN"/>
+          </w:rPr>
+          <w:t>1.1.</w:t>
+        </w:r>
+        <w:r>
+          <w:rPr>
+            <w:rFonts w:eastAsiaTheme="minorEastAsia"/>
+            <w:noProof/>
+            <w:kern w:val="2"/>
+            <w:sz w:val="24"/>
+            <w:szCs w:val="24"/>
+            <w14:ligatures w14:val="standardContextual"/>
+          </w:rPr>
+          <w:tab/>
+        </w:r>
+        <w:r>
+          <w:rPr>
+            <w:rStyle w:val="Hyperlink"/>
+            <w:rFonts w:ascii="Times New Roman" w:hAnsi="Times New Roman" w:cs="Times New Roman"/>
             <w:noProof/>
           </w:rPr>
           <w:t>Bài Thực Hành Số 1 - Trộn thư dữ liệu từ Excel</w:t>
@@ -742,7 +770,7 @@
             <w:noProof/>
             <w:webHidden/>
           </w:rPr>
-          <w:instrText xml:space="preserve"> PAGEREF _Toc241667525 \h </w:instrText>
+          <w:instrText xml:space="preserve"> PAGEREF _Toc241668988 \h </w:instrText>
         </w:r>
         <w:r>
           <w:rPr>
@@ -777,6 +805,7 @@
       <w:pPr>
         <w:pStyle w:val="TOC2"/>
         <w:tabs>
+          <w:tab w:val="left" w:pos="960"/>
           <w:tab w:val="right" w:leader="dot" w:pos="9061"/>
         </w:tabs>
         <w:rPr>
@@ -788,10 +817,31 @@
           <w14:ligatures w14:val="standardContextual"/>
         </w:rPr>
       </w:pPr>
-      <w:hyperlink w:anchor="_Toc241667526" w:history="1">
+      <w:hyperlink w:anchor="_Toc241668991" w:history="1">
         <w:r>
           <w:rPr>
             <w:rStyle w:val="Hyperlink"/>
+            <w:rFonts w:ascii="Times New Roman" w:hAnsi="Times New Roman" w:cs="Times New Roman"/>
+            <w:noProof/>
+            <w:lang w:val="vi-VN"/>
+          </w:rPr>
+          <w:t>1.2.</w:t>
+        </w:r>
+        <w:r>
+          <w:rPr>
+            <w:rFonts w:eastAsiaTheme="minorEastAsia"/>
+            <w:noProof/>
+            <w:kern w:val="2"/>
+            <w:sz w:val="24"/>
+            <w:szCs w:val="24"/>
+            <w14:ligatures w14:val="standardContextual"/>
+          </w:rPr>
+          <w:tab/>
+        </w:r>
+        <w:r>
+          <w:rPr>
+            <w:rStyle w:val="Hyperlink"/>
+            <w:rFonts w:ascii="Times New Roman" w:hAnsi="Times New Roman" w:cs="Times New Roman"/>
             <w:noProof/>
           </w:rPr>
           <w:t>Bài thực hành số 2 - Tạo mục lục</w:t>
@@ -815,7 +865,7 @@
             <w:noProof/>
             <w:webHidden/>
           </w:rPr>
-          <w:instrText xml:space="preserve"> PAGEREF _Toc241667526 \h </w:instrText>
+          <w:instrText xml:space="preserve"> PAGEREF _Toc241668991 \h </w:instrText>
         </w:r>
         <w:r>
           <w:rPr>
@@ -850,6 +900,7 @@
       <w:pPr>
         <w:pStyle w:val="TOC2"/>
         <w:tabs>
+          <w:tab w:val="left" w:pos="960"/>
           <w:tab w:val="right" w:leader="dot" w:pos="9061"/>
         </w:tabs>
         <w:rPr>
@@ -861,10 +912,31 @@
           <w14:ligatures w14:val="standardContextual"/>
         </w:rPr>
       </w:pPr>
-      <w:hyperlink w:anchor="_Toc241667527" w:history="1">
+      <w:hyperlink w:anchor="_Toc241668995" w:history="1">
         <w:r>
           <w:rPr>
             <w:rStyle w:val="Hyperlink"/>
+            <w:rFonts w:ascii="Times New Roman" w:hAnsi="Times New Roman" w:cs="Times New Roman"/>
+            <w:noProof/>
+            <w:lang w:val="vi-VN"/>
+          </w:rPr>
+          <w:t>1.3.</w:t>
+        </w:r>
+        <w:r>
+          <w:rPr>
+            <w:rFonts w:eastAsiaTheme="minorEastAsia"/>
+            <w:noProof/>
+            <w:kern w:val="2"/>
+            <w:sz w:val="24"/>
+            <w:szCs w:val="24"/>
+            <w14:ligatures w14:val="standardContextual"/>
+          </w:rPr>
+          <w:tab/>
+        </w:r>
+        <w:r>
+          <w:rPr>
+            <w:rStyle w:val="Hyperlink"/>
+            <w:rFonts w:ascii="Times New Roman" w:hAnsi="Times New Roman" w:cs="Times New Roman"/>
             <w:noProof/>
           </w:rPr>
           <w:t>Bài thực hành số 3 - Google Docs</w:t>
@@ -888,7 +960,7 @@
             <w:noProof/>
             <w:webHidden/>
           </w:rPr>
-          <w:instrText xml:space="preserve"> PAGEREF _Toc241667527 \h </w:instrText>
+          <w:instrText xml:space="preserve"> PAGEREF _Toc241668995 \h </w:instrText>
         </w:r>
         <w:r>
           <w:rPr>
@@ -935,10 +1007,11 @@
           <w14:ligatures w14:val="standardContextual"/>
         </w:rPr>
       </w:pPr>
-      <w:hyperlink w:anchor="_Toc241667528" w:history="1">
+      <w:hyperlink w:anchor="_Toc241668996" w:history="1">
         <w:r>
           <w:rPr>
             <w:rStyle w:val="Hyperlink"/>
+            <w:rFonts w:cs="Times New Roman"/>
             <w:noProof/>
           </w:rPr>
           <w:t>Lab</w:t>
@@ -946,6 +1019,7 @@
         <w:r>
           <w:rPr>
             <w:rStyle w:val="Hyperlink"/>
+            <w:rFonts w:cs="Times New Roman"/>
             <w:noProof/>
             <w:lang w:val="vi-VN"/>
           </w:rPr>
@@ -954,6 +1028,7 @@
         <w:r>
           <w:rPr>
             <w:rStyle w:val="Hyperlink"/>
+            <w:rFonts w:cs="Times New Roman"/>
             <w:noProof/>
           </w:rPr>
           <w:t>03</w:t>
@@ -961,6 +1036,7 @@
         <w:r>
           <w:rPr>
             <w:rStyle w:val="Hyperlink"/>
+            <w:rFonts w:cs="Times New Roman"/>
             <w:noProof/>
             <w:lang w:val="vi-VN"/>
           </w:rPr>
@@ -969,6 +1045,7 @@
         <w:r>
           <w:rPr>
             <w:rStyle w:val="Hyperlink"/>
+            <w:rFonts w:cs="Times New Roman"/>
             <w:noProof/>
           </w:rPr>
           <w:t>Microsoft Excel và Google Sheets</w:t>
@@ -992,7 +1069,7 @@
             <w:noProof/>
             <w:webHidden/>
           </w:rPr>
-          <w:instrText xml:space="preserve"> PAGEREF _Toc241667528 \h </w:instrText>
+          <w:instrText xml:space="preserve"> PAGEREF _Toc241668996 \h </w:instrText>
         </w:r>
         <w:r>
           <w:rPr>
@@ -1027,6 +1104,7 @@
       <w:pPr>
         <w:pStyle w:val="TOC2"/>
         <w:tabs>
+          <w:tab w:val="left" w:pos="960"/>
           <w:tab w:val="right" w:leader="dot" w:pos="9061"/>
         </w:tabs>
         <w:rPr>
@@ -1038,10 +1116,31 @@
           <w14:ligatures w14:val="standardContextual"/>
         </w:rPr>
       </w:pPr>
-      <w:hyperlink w:anchor="_Toc241667529" w:history="1">
+      <w:hyperlink w:anchor="_Toc241668997" w:history="1">
         <w:r>
           <w:rPr>
             <w:rStyle w:val="Hyperlink"/>
+            <w:rFonts w:ascii="Times New Roman" w:hAnsi="Times New Roman" w:cs="Times New Roman"/>
+            <w:noProof/>
+            <w:lang w:val="vi-VN"/>
+          </w:rPr>
+          <w:t>1.1.</w:t>
+        </w:r>
+        <w:r>
+          <w:rPr>
+            <w:rFonts w:eastAsiaTheme="minorEastAsia"/>
+            <w:noProof/>
+            <w:kern w:val="2"/>
+            <w:sz w:val="24"/>
+            <w:szCs w:val="24"/>
+            <w14:ligatures w14:val="standardContextual"/>
+          </w:rPr>
+          <w:tab/>
+        </w:r>
+        <w:r>
+          <w:rPr>
+            <w:rStyle w:val="Hyperlink"/>
+            <w:rFonts w:ascii="Times New Roman" w:hAnsi="Times New Roman" w:cs="Times New Roman"/>
             <w:noProof/>
           </w:rPr>
           <w:t>Microsoft Excel</w:t>
@@ -1065,7 +1164,7 @@
             <w:noProof/>
             <w:webHidden/>
           </w:rPr>
-          <w:instrText xml:space="preserve"> PAGEREF _Toc241667529 \h </w:instrText>
+          <w:instrText xml:space="preserve"> PAGEREF _Toc241668997 \h </w:instrText>
         </w:r>
         <w:r>
           <w:rPr>
@@ -1100,6 +1199,7 @@
       <w:pPr>
         <w:pStyle w:val="TOC2"/>
         <w:tabs>
+          <w:tab w:val="left" w:pos="960"/>
           <w:tab w:val="right" w:leader="dot" w:pos="9061"/>
         </w:tabs>
         <w:rPr>
@@ -1111,10 +1211,31 @@
           <w14:ligatures w14:val="standardContextual"/>
         </w:rPr>
       </w:pPr>
-      <w:hyperlink w:anchor="_Toc241667530" w:history="1">
+      <w:hyperlink w:anchor="_Toc241669000" w:history="1">
         <w:r>
           <w:rPr>
             <w:rStyle w:val="Hyperlink"/>
+            <w:rFonts w:ascii="Times New Roman" w:hAnsi="Times New Roman" w:cs="Times New Roman"/>
+            <w:noProof/>
+            <w:lang w:val="vi-VN"/>
+          </w:rPr>
+          <w:t>1.2.</w:t>
+        </w:r>
+        <w:r>
+          <w:rPr>
+            <w:rFonts w:eastAsiaTheme="minorEastAsia"/>
+            <w:noProof/>
+            <w:kern w:val="2"/>
+            <w:sz w:val="24"/>
+            <w:szCs w:val="24"/>
+            <w14:ligatures w14:val="standardContextual"/>
+          </w:rPr>
+          <w:tab/>
+        </w:r>
+        <w:r>
+          <w:rPr>
+            <w:rStyle w:val="Hyperlink"/>
+            <w:rFonts w:ascii="Times New Roman" w:hAnsi="Times New Roman" w:cs="Times New Roman"/>
             <w:noProof/>
           </w:rPr>
           <w:t>Google Sheet</w:t>
@@ -1138,7 +1259,7 @@
             <w:noProof/>
             <w:webHidden/>
           </w:rPr>
-          <w:instrText xml:space="preserve"> PAGEREF _Toc241667530 \h </w:instrText>
+          <w:instrText xml:space="preserve"> PAGEREF _Toc241669000 \h </w:instrText>
         </w:r>
         <w:r>
           <w:rPr>
@@ -1185,10 +1306,11 @@
           <w14:ligatures w14:val="standardContextual"/>
         </w:rPr>
       </w:pPr>
-      <w:hyperlink w:anchor="_Toc241667531" w:history="1">
+      <w:hyperlink w:anchor="_Toc241669001" w:history="1">
         <w:r>
           <w:rPr>
             <w:rStyle w:val="Hyperlink"/>
+            <w:rFonts w:cs="Times New Roman"/>
             <w:noProof/>
           </w:rPr>
           <w:t>Lab</w:t>
@@ -1196,6 +1318,7 @@
         <w:r>
           <w:rPr>
             <w:rStyle w:val="Hyperlink"/>
+            <w:rFonts w:cs="Times New Roman"/>
             <w:noProof/>
             <w:lang w:val="vi-VN"/>
           </w:rPr>
@@ -1204,6 +1327,7 @@
         <w:r>
           <w:rPr>
             <w:rStyle w:val="Hyperlink"/>
+            <w:rFonts w:cs="Times New Roman"/>
             <w:noProof/>
           </w:rPr>
           <w:t>04</w:t>
@@ -1211,6 +1335,7 @@
         <w:r>
           <w:rPr>
             <w:rStyle w:val="Hyperlink"/>
+            <w:rFonts w:cs="Times New Roman"/>
             <w:noProof/>
             <w:lang w:val="vi-VN"/>
           </w:rPr>
@@ -1219,6 +1344,7 @@
         <w:r>
           <w:rPr>
             <w:rStyle w:val="Hyperlink"/>
+            <w:rFonts w:cs="Times New Roman"/>
             <w:noProof/>
           </w:rPr>
           <w:t xml:space="preserve"> Microsoft Powerpoint</w:t>
@@ -1242,7 +1368,7 @@
             <w:noProof/>
             <w:webHidden/>
           </w:rPr>
-          <w:instrText xml:space="preserve"> PAGEREF _Toc241667531 \h </w:instrText>
+          <w:instrText xml:space="preserve"> PAGEREF _Toc241669001 \h </w:instrText>
         </w:r>
         <w:r>
           <w:rPr>
@@ -1277,6 +1403,7 @@
       <w:pPr>
         <w:pStyle w:val="TOC2"/>
         <w:tabs>
+          <w:tab w:val="left" w:pos="960"/>
           <w:tab w:val="right" w:leader="dot" w:pos="9061"/>
         </w:tabs>
         <w:rPr>
@@ -1288,10 +1415,31 @@
           <w14:ligatures w14:val="standardContextual"/>
         </w:rPr>
       </w:pPr>
-      <w:hyperlink w:anchor="_Toc241667532" w:history="1">
+      <w:hyperlink w:anchor="_Toc241669003" w:history="1">
         <w:r>
           <w:rPr>
             <w:rStyle w:val="Hyperlink"/>
+            <w:rFonts w:ascii="Times New Roman" w:hAnsi="Times New Roman" w:cs="Times New Roman"/>
+            <w:noProof/>
+            <w:lang w:val="vi-VN"/>
+          </w:rPr>
+          <w:t>1.1.</w:t>
+        </w:r>
+        <w:r>
+          <w:rPr>
+            <w:rFonts w:eastAsiaTheme="minorEastAsia"/>
+            <w:noProof/>
+            <w:kern w:val="2"/>
+            <w:sz w:val="24"/>
+            <w:szCs w:val="24"/>
+            <w14:ligatures w14:val="standardContextual"/>
+          </w:rPr>
+          <w:tab/>
+        </w:r>
+        <w:r>
+          <w:rPr>
+            <w:rStyle w:val="Hyperlink"/>
+            <w:rFonts w:ascii="Times New Roman" w:hAnsi="Times New Roman" w:cs="Times New Roman"/>
             <w:noProof/>
           </w:rPr>
           <w:t>Bài thực hành số 1</w:t>
@@ -1315,7 +1463,7 @@
             <w:noProof/>
             <w:webHidden/>
           </w:rPr>
-          <w:instrText xml:space="preserve"> PAGEREF _Toc241667532 \h </w:instrText>
+          <w:instrText xml:space="preserve"> PAGEREF _Toc241669003 \h </w:instrText>
         </w:r>
         <w:r>
           <w:rPr>
@@ -1350,6 +1498,7 @@
       <w:pPr>
         <w:pStyle w:val="TOC2"/>
         <w:tabs>
+          <w:tab w:val="left" w:pos="960"/>
           <w:tab w:val="right" w:leader="dot" w:pos="9061"/>
         </w:tabs>
         <w:rPr>
@@ -1361,10 +1510,31 @@
           <w14:ligatures w14:val="standardContextual"/>
         </w:rPr>
       </w:pPr>
-      <w:hyperlink w:anchor="_Toc241667533" w:history="1">
+      <w:hyperlink w:anchor="_Toc241669006" w:history="1">
         <w:r>
           <w:rPr>
             <w:rStyle w:val="Hyperlink"/>
+            <w:rFonts w:ascii="Times New Roman" w:hAnsi="Times New Roman" w:cs="Times New Roman"/>
+            <w:noProof/>
+            <w:lang w:val="vi-VN"/>
+          </w:rPr>
+          <w:t>1.2.</w:t>
+        </w:r>
+        <w:r>
+          <w:rPr>
+            <w:rFonts w:eastAsiaTheme="minorEastAsia"/>
+            <w:noProof/>
+            <w:kern w:val="2"/>
+            <w:sz w:val="24"/>
+            <w:szCs w:val="24"/>
+            <w14:ligatures w14:val="standardContextual"/>
+          </w:rPr>
+          <w:tab/>
+        </w:r>
+        <w:r>
+          <w:rPr>
+            <w:rStyle w:val="Hyperlink"/>
+            <w:rFonts w:ascii="Times New Roman" w:hAnsi="Times New Roman" w:cs="Times New Roman"/>
             <w:noProof/>
           </w:rPr>
           <w:t>Bài thực hành số 2</w:t>
@@ -1388,7 +1558,7 @@
             <w:noProof/>
             <w:webHidden/>
           </w:rPr>
-          <w:instrText xml:space="preserve"> PAGEREF _Toc241667533 \h </w:instrText>
+          <w:instrText xml:space="preserve"> PAGEREF _Toc241669006 \h </w:instrText>
         </w:r>
         <w:r>
           <w:rPr>
@@ -1408,7 +1578,7 @@
             <w:noProof/>
             <w:webHidden/>
           </w:rPr>
-          <w:t>4</w:t>
+          <w:t>5</w:t>
         </w:r>
         <w:r>
           <w:rPr>
@@ -1435,10 +1605,11 @@
           <w14:ligatures w14:val="standardContextual"/>
         </w:rPr>
       </w:pPr>
-      <w:hyperlink w:anchor="_Toc241667534" w:history="1">
+      <w:hyperlink w:anchor="_Toc241669007" w:history="1">
         <w:r>
           <w:rPr>
             <w:rStyle w:val="Hyperlink"/>
+            <w:rFonts w:cs="Times New Roman"/>
             <w:noProof/>
             <w:lang w:val="vi-VN"/>
           </w:rPr>
@@ -1463,7 +1634,7 @@
             <w:noProof/>
             <w:webHidden/>
           </w:rPr>
-          <w:instrText xml:space="preserve"> PAGEREF _Toc241667534 \h </w:instrText>
+          <w:instrText xml:space="preserve"> PAGEREF _Toc241669007 \h </w:instrText>
         </w:r>
         <w:r>
           <w:rPr>
@@ -1483,7 +1654,7 @@
             <w:noProof/>
             <w:webHidden/>
           </w:rPr>
-          <w:t>4</w:t>
+          <w:t>5</w:t>
         </w:r>
         <w:r>
           <w:rPr>
@@ -1527,39 +1698,58 @@
     <w:p>
       <w:pPr>
         <w:pStyle w:val="Heading1"/>
-        <w:rPr>
-          <w:lang w:val="vi-VN"/>
-        </w:rPr>
-      </w:pPr>
-      <w:bookmarkStart w:id="0" w:name="_Toc241667524"/>
-      <w:r>
+        <w:jc w:val="center"/>
+        <w:rPr>
+          <w:rFonts w:ascii="Times New Roman" w:hAnsi="Times New Roman" w:cs="Times New Roman"/>
+          <w:lang w:val="vi-VN"/>
+        </w:rPr>
+      </w:pPr>
+      <w:bookmarkStart w:id="0" w:name="_Toc241668987"/>
+      <w:r>
+        <w:rPr>
+          <w:rFonts w:ascii="Times New Roman" w:hAnsi="Times New Roman" w:cs="Times New Roman"/>
+        </w:rPr>
         <w:lastRenderedPageBreak/>
         <w:t>Lab</w:t>
       </w:r>
       <w:r>
         <w:rPr>
+          <w:rFonts w:ascii="Times New Roman" w:hAnsi="Times New Roman" w:cs="Times New Roman"/>
           <w:lang w:val="vi-VN"/>
         </w:rPr>
         <w:t xml:space="preserve"> </w:t>
       </w:r>
       <w:r>
+        <w:rPr>
+          <w:rFonts w:ascii="Times New Roman" w:hAnsi="Times New Roman" w:cs="Times New Roman"/>
+        </w:rPr>
         <w:t>02</w:t>
       </w:r>
       <w:r>
         <w:rPr>
+          <w:rFonts w:ascii="Times New Roman" w:hAnsi="Times New Roman" w:cs="Times New Roman"/>
           <w:lang w:val="vi-VN"/>
         </w:rPr>
         <w:t>:</w:t>
       </w:r>
       <w:r>
+        <w:rPr>
+          <w:rFonts w:ascii="Times New Roman" w:hAnsi="Times New Roman" w:cs="Times New Roman"/>
+        </w:rPr>
         <w:t xml:space="preserve"> Microsoft Word </w:t>
       </w:r>
       <w:proofErr w:type="spellStart"/>
       <w:r>
+        <w:rPr>
+          <w:rFonts w:ascii="Times New Roman" w:hAnsi="Times New Roman" w:cs="Times New Roman"/>
+        </w:rPr>
         <w:t>và</w:t>
       </w:r>
       <w:proofErr w:type="spellEnd"/>
       <w:r>
+        <w:rPr>
+          <w:rFonts w:ascii="Times New Roman" w:hAnsi="Times New Roman" w:cs="Times New Roman"/>
+        </w:rPr>
         <w:t xml:space="preserve"> Google Docs</w:t>
       </w:r>
       <w:bookmarkEnd w:id="0"/>
@@ -1567,81 +1757,140 @@
     <w:p>
       <w:pPr>
         <w:pStyle w:val="Heading2"/>
-        <w:rPr>
-          <w:lang w:val="vi-VN"/>
-        </w:rPr>
-      </w:pPr>
-      <w:bookmarkStart w:id="1" w:name="_Toc241667525"/>
+        <w:numPr>
+          <w:ilvl w:val="1"/>
+          <w:numId w:val="1"/>
+        </w:numPr>
+        <w:rPr>
+          <w:rFonts w:ascii="Times New Roman" w:hAnsi="Times New Roman" w:cs="Times New Roman"/>
+          <w:lang w:val="vi-VN"/>
+        </w:rPr>
+      </w:pPr>
+      <w:bookmarkStart w:id="1" w:name="_Toc241668988"/>
       <w:proofErr w:type="spellStart"/>
       <w:r>
+        <w:rPr>
+          <w:rFonts w:ascii="Times New Roman" w:hAnsi="Times New Roman" w:cs="Times New Roman"/>
+        </w:rPr>
         <w:t>Bài</w:t>
       </w:r>
       <w:proofErr w:type="spellEnd"/>
       <w:r>
+        <w:rPr>
+          <w:rFonts w:ascii="Times New Roman" w:hAnsi="Times New Roman" w:cs="Times New Roman"/>
+        </w:rPr>
         <w:t xml:space="preserve"> </w:t>
       </w:r>
       <w:proofErr w:type="spellStart"/>
       <w:r>
+        <w:rPr>
+          <w:rFonts w:ascii="Times New Roman" w:hAnsi="Times New Roman" w:cs="Times New Roman"/>
+        </w:rPr>
         <w:t>Thực</w:t>
       </w:r>
       <w:proofErr w:type="spellEnd"/>
       <w:r>
+        <w:rPr>
+          <w:rFonts w:ascii="Times New Roman" w:hAnsi="Times New Roman" w:cs="Times New Roman"/>
+        </w:rPr>
         <w:t xml:space="preserve"> </w:t>
       </w:r>
       <w:proofErr w:type="spellStart"/>
       <w:r>
+        <w:rPr>
+          <w:rFonts w:ascii="Times New Roman" w:hAnsi="Times New Roman" w:cs="Times New Roman"/>
+        </w:rPr>
         <w:t>Hành</w:t>
       </w:r>
       <w:proofErr w:type="spellEnd"/>
       <w:r>
+        <w:rPr>
+          <w:rFonts w:ascii="Times New Roman" w:hAnsi="Times New Roman" w:cs="Times New Roman"/>
+        </w:rPr>
         <w:t xml:space="preserve"> </w:t>
       </w:r>
       <w:proofErr w:type="spellStart"/>
       <w:r>
+        <w:rPr>
+          <w:rFonts w:ascii="Times New Roman" w:hAnsi="Times New Roman" w:cs="Times New Roman"/>
+        </w:rPr>
         <w:t>Số</w:t>
       </w:r>
       <w:proofErr w:type="spellEnd"/>
       <w:r>
+        <w:rPr>
+          <w:rFonts w:ascii="Times New Roman" w:hAnsi="Times New Roman" w:cs="Times New Roman"/>
+        </w:rPr>
         <w:t xml:space="preserve"> 1 - </w:t>
       </w:r>
       <w:proofErr w:type="spellStart"/>
       <w:r>
+        <w:rPr>
+          <w:rFonts w:ascii="Times New Roman" w:hAnsi="Times New Roman" w:cs="Times New Roman"/>
+        </w:rPr>
         <w:t>Trộn</w:t>
       </w:r>
       <w:proofErr w:type="spellEnd"/>
       <w:r>
+        <w:rPr>
+          <w:rFonts w:ascii="Times New Roman" w:hAnsi="Times New Roman" w:cs="Times New Roman"/>
+        </w:rPr>
         <w:t xml:space="preserve"> </w:t>
       </w:r>
       <w:proofErr w:type="spellStart"/>
       <w:r>
+        <w:rPr>
+          <w:rFonts w:ascii="Times New Roman" w:hAnsi="Times New Roman" w:cs="Times New Roman"/>
+        </w:rPr>
         <w:t>thư</w:t>
       </w:r>
       <w:proofErr w:type="spellEnd"/>
       <w:r>
+        <w:rPr>
+          <w:rFonts w:ascii="Times New Roman" w:hAnsi="Times New Roman" w:cs="Times New Roman"/>
+        </w:rPr>
         <w:t xml:space="preserve"> </w:t>
       </w:r>
       <w:proofErr w:type="spellStart"/>
       <w:r>
+        <w:rPr>
+          <w:rFonts w:ascii="Times New Roman" w:hAnsi="Times New Roman" w:cs="Times New Roman"/>
+        </w:rPr>
         <w:t>dữ</w:t>
       </w:r>
       <w:proofErr w:type="spellEnd"/>
       <w:r>
+        <w:rPr>
+          <w:rFonts w:ascii="Times New Roman" w:hAnsi="Times New Roman" w:cs="Times New Roman"/>
+        </w:rPr>
         <w:t xml:space="preserve"> </w:t>
       </w:r>
       <w:proofErr w:type="spellStart"/>
       <w:r>
+        <w:rPr>
+          <w:rFonts w:ascii="Times New Roman" w:hAnsi="Times New Roman" w:cs="Times New Roman"/>
+        </w:rPr>
         <w:t>liệu</w:t>
       </w:r>
       <w:proofErr w:type="spellEnd"/>
       <w:r>
+        <w:rPr>
+          <w:rFonts w:ascii="Times New Roman" w:hAnsi="Times New Roman" w:cs="Times New Roman"/>
+        </w:rPr>
         <w:t xml:space="preserve"> </w:t>
       </w:r>
       <w:proofErr w:type="spellStart"/>
       <w:r>
+        <w:rPr>
+          <w:rFonts w:ascii="Times New Roman" w:hAnsi="Times New Roman" w:cs="Times New Roman"/>
+        </w:rPr>
         <w:t>từ</w:t>
       </w:r>
       <w:proofErr w:type="spellEnd"/>
       <w:r>
+        <w:rPr>
+          <w:rFonts w:ascii="Times New Roman" w:hAnsi="Times New Roman" w:cs="Times New Roman"/>
+        </w:rPr>
         <w:t xml:space="preserve"> Excel</w:t>
       </w:r>
       <w:bookmarkEnd w:id="1"/>
@@ -1649,6 +1898,7 @@
     <w:p>
       <w:pPr>
         <w:rPr>
+          <w:rFonts w:ascii="Times New Roman" w:hAnsi="Times New Roman" w:cs="Times New Roman"/>
           <w:lang w:val="vi-VN"/>
         </w:rPr>
       </w:pPr>
@@ -1659,11 +1909,13 @@
       <w:pPr>
         <w:jc w:val="center"/>
         <w:rPr>
-          <w:lang w:val="vi-VN"/>
-        </w:rPr>
-      </w:pPr>
-      <w:r>
-        <w:rPr>
+          <w:rFonts w:ascii="Times New Roman" w:hAnsi="Times New Roman" w:cs="Times New Roman"/>
+          <w:lang w:val="vi-VN"/>
+        </w:rPr>
+      </w:pPr>
+      <w:r>
+        <w:rPr>
+          <w:rFonts w:ascii="Times New Roman" w:hAnsi="Times New Roman" w:cs="Times New Roman"/>
           <w:lang w:val="vi-VN"/>
         </w:rPr>
         <w:object w:dxaOrig="1520" w:dyaOrig="989" w14:anchorId="1CFD0E4F">
@@ -1687,9 +1939,9 @@
             <o:lock v:ext="edit" aspectratio="t"/>
           </v:shapetype>
           <v:shape id="_x0000_i1031" type="#_x0000_t75" style="width:76.2pt;height:49.2pt" o:ole="">
-            <v:imagedata r:id="rId8" o:title=""/>
+            <v:imagedata r:id="rId9" o:title=""/>
           </v:shape>
-          <o:OLEObject Type="Embed" ProgID="Word.Document.12" ShapeID="_x0000_i1031" DrawAspect="Icon" ObjectID="_1852281178" r:id="rId9">
+          <o:OLEObject Type="Embed" ProgID="Word.Document.12" ShapeID="_x0000_i1031" DrawAspect="Icon" ObjectID="_1852281845" r:id="rId10">
             <o:FieldCodes>\s</o:FieldCodes>
           </o:OLEObject>
         </w:object>
@@ -1697,85 +1949,181 @@
     </w:p>
     <w:p>
       <w:pPr>
+        <w:pStyle w:val="ListParagraph"/>
+        <w:keepNext/>
+        <w:keepLines/>
+        <w:numPr>
+          <w:ilvl w:val="0"/>
+          <w:numId w:val="2"/>
+        </w:numPr>
+        <w:spacing w:before="40" w:after="0"/>
+        <w:contextualSpacing w:val="0"/>
+        <w:outlineLvl w:val="1"/>
+        <w:rPr>
+          <w:rFonts w:ascii="Times New Roman" w:eastAsiaTheme="majorEastAsia" w:hAnsi="Times New Roman" w:cs="Times New Roman"/>
+          <w:vanish/>
+          <w:color w:val="2E74B5" w:themeColor="accent1" w:themeShade="BF"/>
+          <w:sz w:val="26"/>
+          <w:szCs w:val="26"/>
+        </w:rPr>
+      </w:pPr>
+      <w:bookmarkStart w:id="3" w:name="_Toc241668961"/>
+      <w:bookmarkStart w:id="4" w:name="_Toc241668989"/>
+      <w:bookmarkEnd w:id="3"/>
+      <w:bookmarkEnd w:id="4"/>
+    </w:p>
+    <w:p>
+      <w:pPr>
+        <w:pStyle w:val="ListParagraph"/>
+        <w:keepNext/>
+        <w:keepLines/>
+        <w:numPr>
+          <w:ilvl w:val="1"/>
+          <w:numId w:val="2"/>
+        </w:numPr>
+        <w:spacing w:before="40" w:after="0"/>
+        <w:contextualSpacing w:val="0"/>
+        <w:outlineLvl w:val="1"/>
+        <w:rPr>
+          <w:rFonts w:ascii="Times New Roman" w:eastAsiaTheme="majorEastAsia" w:hAnsi="Times New Roman" w:cs="Times New Roman"/>
+          <w:vanish/>
+          <w:color w:val="2E74B5" w:themeColor="accent1" w:themeShade="BF"/>
+          <w:sz w:val="26"/>
+          <w:szCs w:val="26"/>
+        </w:rPr>
+      </w:pPr>
+      <w:bookmarkStart w:id="5" w:name="_Toc241668962"/>
+      <w:bookmarkStart w:id="6" w:name="_Toc241668990"/>
+      <w:bookmarkEnd w:id="5"/>
+      <w:bookmarkEnd w:id="6"/>
+    </w:p>
+    <w:p>
+      <w:pPr>
         <w:pStyle w:val="Heading2"/>
-        <w:rPr>
-          <w:lang w:val="vi-VN"/>
-        </w:rPr>
-      </w:pPr>
-      <w:bookmarkStart w:id="3" w:name="_Toc241667526"/>
+        <w:numPr>
+          <w:ilvl w:val="1"/>
+          <w:numId w:val="2"/>
+        </w:numPr>
+        <w:rPr>
+          <w:rFonts w:ascii="Times New Roman" w:hAnsi="Times New Roman" w:cs="Times New Roman"/>
+          <w:lang w:val="vi-VN"/>
+        </w:rPr>
+      </w:pPr>
+      <w:bookmarkStart w:id="7" w:name="_Toc241668991"/>
       <w:proofErr w:type="spellStart"/>
       <w:r>
+        <w:rPr>
+          <w:rFonts w:ascii="Times New Roman" w:hAnsi="Times New Roman" w:cs="Times New Roman"/>
+        </w:rPr>
         <w:t>Bài</w:t>
       </w:r>
       <w:proofErr w:type="spellEnd"/>
       <w:r>
+        <w:rPr>
+          <w:rFonts w:ascii="Times New Roman" w:hAnsi="Times New Roman" w:cs="Times New Roman"/>
+        </w:rPr>
         <w:t xml:space="preserve"> </w:t>
       </w:r>
       <w:proofErr w:type="spellStart"/>
       <w:r>
+        <w:rPr>
+          <w:rFonts w:ascii="Times New Roman" w:hAnsi="Times New Roman" w:cs="Times New Roman"/>
+        </w:rPr>
         <w:t>thực</w:t>
       </w:r>
       <w:proofErr w:type="spellEnd"/>
       <w:r>
+        <w:rPr>
+          <w:rFonts w:ascii="Times New Roman" w:hAnsi="Times New Roman" w:cs="Times New Roman"/>
+        </w:rPr>
         <w:t xml:space="preserve"> </w:t>
       </w:r>
       <w:proofErr w:type="spellStart"/>
       <w:r>
+        <w:rPr>
+          <w:rFonts w:ascii="Times New Roman" w:hAnsi="Times New Roman" w:cs="Times New Roman"/>
+        </w:rPr>
         <w:t>hành</w:t>
       </w:r>
       <w:proofErr w:type="spellEnd"/>
       <w:r>
+        <w:rPr>
+          <w:rFonts w:ascii="Times New Roman" w:hAnsi="Times New Roman" w:cs="Times New Roman"/>
+        </w:rPr>
         <w:t xml:space="preserve"> </w:t>
       </w:r>
       <w:proofErr w:type="spellStart"/>
       <w:r>
+        <w:rPr>
+          <w:rFonts w:ascii="Times New Roman" w:hAnsi="Times New Roman" w:cs="Times New Roman"/>
+        </w:rPr>
         <w:t>số</w:t>
       </w:r>
       <w:proofErr w:type="spellEnd"/>
       <w:r>
+        <w:rPr>
+          <w:rFonts w:ascii="Times New Roman" w:hAnsi="Times New Roman" w:cs="Times New Roman"/>
+        </w:rPr>
         <w:t xml:space="preserve"> 2 - </w:t>
       </w:r>
       <w:proofErr w:type="spellStart"/>
       <w:r>
+        <w:rPr>
+          <w:rFonts w:ascii="Times New Roman" w:hAnsi="Times New Roman" w:cs="Times New Roman"/>
+        </w:rPr>
         <w:t>Tạo</w:t>
       </w:r>
       <w:proofErr w:type="spellEnd"/>
       <w:r>
+        <w:rPr>
+          <w:rFonts w:ascii="Times New Roman" w:hAnsi="Times New Roman" w:cs="Times New Roman"/>
+        </w:rPr>
         <w:t xml:space="preserve"> </w:t>
       </w:r>
       <w:proofErr w:type="spellStart"/>
       <w:r>
+        <w:rPr>
+          <w:rFonts w:ascii="Times New Roman" w:hAnsi="Times New Roman" w:cs="Times New Roman"/>
+        </w:rPr>
         <w:t>mục</w:t>
       </w:r>
       <w:proofErr w:type="spellEnd"/>
       <w:r>
+        <w:rPr>
+          <w:rFonts w:ascii="Times New Roman" w:hAnsi="Times New Roman" w:cs="Times New Roman"/>
+        </w:rPr>
         <w:t xml:space="preserve"> </w:t>
       </w:r>
       <w:proofErr w:type="spellStart"/>
       <w:r>
+        <w:rPr>
+          <w:rFonts w:ascii="Times New Roman" w:hAnsi="Times New Roman" w:cs="Times New Roman"/>
+        </w:rPr>
         <w:t>lục</w:t>
       </w:r>
-      <w:bookmarkEnd w:id="3"/>
+      <w:bookmarkEnd w:id="7"/>
       <w:proofErr w:type="spellEnd"/>
     </w:p>
-    <w:bookmarkStart w:id="4" w:name="_MON_1852280489"/>
-    <w:bookmarkEnd w:id="4"/>
+    <w:bookmarkStart w:id="8" w:name="_MON_1852280489"/>
+    <w:bookmarkEnd w:id="8"/>
     <w:p>
       <w:pPr>
         <w:jc w:val="center"/>
         <w:rPr>
-          <w:lang w:val="vi-VN"/>
-        </w:rPr>
-      </w:pPr>
-      <w:r>
-        <w:rPr>
+          <w:rFonts w:ascii="Times New Roman" w:hAnsi="Times New Roman" w:cs="Times New Roman"/>
+          <w:lang w:val="vi-VN"/>
+        </w:rPr>
+      </w:pPr>
+      <w:r>
+        <w:rPr>
+          <w:rFonts w:ascii="Times New Roman" w:hAnsi="Times New Roman" w:cs="Times New Roman"/>
           <w:lang w:val="vi-VN"/>
         </w:rPr>
         <w:object w:dxaOrig="1520" w:dyaOrig="989" w14:anchorId="22BBE930">
           <v:shape id="_x0000_i1033" type="#_x0000_t75" style="width:76.2pt;height:49.2pt" o:ole="">
-            <v:imagedata r:id="rId10" o:title=""/>
+            <v:imagedata r:id="rId11" o:title=""/>
           </v:shape>
-          <o:OLEObject Type="Embed" ProgID="Word.Document.12" ShapeID="_x0000_i1033" DrawAspect="Icon" ObjectID="_1852281179" r:id="rId11">
+          <o:OLEObject Type="Embed" ProgID="Word.Document.12" ShapeID="_x0000_i1033" DrawAspect="Icon" ObjectID="_1852281846" r:id="rId12">
             <o:FieldCodes>\s</o:FieldCodes>
           </o:OLEObject>
         </w:object>
@@ -1783,64 +2131,170 @@
     </w:p>
     <w:p>
       <w:pPr>
+        <w:pStyle w:val="ListParagraph"/>
+        <w:keepNext/>
+        <w:keepLines/>
+        <w:numPr>
+          <w:ilvl w:val="0"/>
+          <w:numId w:val="3"/>
+        </w:numPr>
+        <w:spacing w:before="40" w:after="0"/>
+        <w:contextualSpacing w:val="0"/>
+        <w:outlineLvl w:val="1"/>
+        <w:rPr>
+          <w:rFonts w:ascii="Times New Roman" w:eastAsiaTheme="majorEastAsia" w:hAnsi="Times New Roman" w:cs="Times New Roman"/>
+          <w:vanish/>
+          <w:color w:val="2E74B5" w:themeColor="accent1" w:themeShade="BF"/>
+          <w:sz w:val="26"/>
+          <w:szCs w:val="26"/>
+        </w:rPr>
+      </w:pPr>
+      <w:bookmarkStart w:id="9" w:name="_Toc241668964"/>
+      <w:bookmarkStart w:id="10" w:name="_Toc241668992"/>
+      <w:bookmarkEnd w:id="9"/>
+      <w:bookmarkEnd w:id="10"/>
+    </w:p>
+    <w:p>
+      <w:pPr>
+        <w:pStyle w:val="ListParagraph"/>
+        <w:keepNext/>
+        <w:keepLines/>
+        <w:numPr>
+          <w:ilvl w:val="1"/>
+          <w:numId w:val="3"/>
+        </w:numPr>
+        <w:spacing w:before="40" w:after="0"/>
+        <w:contextualSpacing w:val="0"/>
+        <w:outlineLvl w:val="1"/>
+        <w:rPr>
+          <w:rFonts w:ascii="Times New Roman" w:eastAsiaTheme="majorEastAsia" w:hAnsi="Times New Roman" w:cs="Times New Roman"/>
+          <w:vanish/>
+          <w:color w:val="2E74B5" w:themeColor="accent1" w:themeShade="BF"/>
+          <w:sz w:val="26"/>
+          <w:szCs w:val="26"/>
+        </w:rPr>
+      </w:pPr>
+      <w:bookmarkStart w:id="11" w:name="_Toc241668965"/>
+      <w:bookmarkStart w:id="12" w:name="_Toc241668993"/>
+      <w:bookmarkEnd w:id="11"/>
+      <w:bookmarkEnd w:id="12"/>
+    </w:p>
+    <w:p>
+      <w:pPr>
+        <w:pStyle w:val="ListParagraph"/>
+        <w:keepNext/>
+        <w:keepLines/>
+        <w:numPr>
+          <w:ilvl w:val="1"/>
+          <w:numId w:val="3"/>
+        </w:numPr>
+        <w:spacing w:before="40" w:after="0"/>
+        <w:contextualSpacing w:val="0"/>
+        <w:outlineLvl w:val="1"/>
+        <w:rPr>
+          <w:rFonts w:ascii="Times New Roman" w:eastAsiaTheme="majorEastAsia" w:hAnsi="Times New Roman" w:cs="Times New Roman"/>
+          <w:vanish/>
+          <w:color w:val="2E74B5" w:themeColor="accent1" w:themeShade="BF"/>
+          <w:sz w:val="26"/>
+          <w:szCs w:val="26"/>
+        </w:rPr>
+      </w:pPr>
+      <w:bookmarkStart w:id="13" w:name="_Toc241668966"/>
+      <w:bookmarkStart w:id="14" w:name="_Toc241668994"/>
+      <w:bookmarkEnd w:id="13"/>
+      <w:bookmarkEnd w:id="14"/>
+    </w:p>
+    <w:p>
+      <w:pPr>
         <w:pStyle w:val="Heading2"/>
-        <w:rPr>
-          <w:lang w:val="vi-VN"/>
-        </w:rPr>
-      </w:pPr>
-      <w:bookmarkStart w:id="5" w:name="_Toc241667527"/>
+        <w:numPr>
+          <w:ilvl w:val="1"/>
+          <w:numId w:val="3"/>
+        </w:numPr>
+        <w:rPr>
+          <w:rFonts w:ascii="Times New Roman" w:hAnsi="Times New Roman" w:cs="Times New Roman"/>
+          <w:lang w:val="vi-VN"/>
+        </w:rPr>
+      </w:pPr>
+      <w:bookmarkStart w:id="15" w:name="_Toc241668995"/>
       <w:proofErr w:type="spellStart"/>
       <w:r>
+        <w:rPr>
+          <w:rFonts w:ascii="Times New Roman" w:hAnsi="Times New Roman" w:cs="Times New Roman"/>
+        </w:rPr>
         <w:t>Bài</w:t>
       </w:r>
       <w:proofErr w:type="spellEnd"/>
       <w:r>
+        <w:rPr>
+          <w:rFonts w:ascii="Times New Roman" w:hAnsi="Times New Roman" w:cs="Times New Roman"/>
+        </w:rPr>
         <w:t xml:space="preserve"> </w:t>
       </w:r>
       <w:proofErr w:type="spellStart"/>
       <w:r>
+        <w:rPr>
+          <w:rFonts w:ascii="Times New Roman" w:hAnsi="Times New Roman" w:cs="Times New Roman"/>
+        </w:rPr>
         <w:t>thực</w:t>
       </w:r>
       <w:proofErr w:type="spellEnd"/>
       <w:r>
+        <w:rPr>
+          <w:rFonts w:ascii="Times New Roman" w:hAnsi="Times New Roman" w:cs="Times New Roman"/>
+        </w:rPr>
         <w:t xml:space="preserve"> </w:t>
       </w:r>
       <w:proofErr w:type="spellStart"/>
       <w:r>
+        <w:rPr>
+          <w:rFonts w:ascii="Times New Roman" w:hAnsi="Times New Roman" w:cs="Times New Roman"/>
+        </w:rPr>
         <w:t>hành</w:t>
       </w:r>
       <w:proofErr w:type="spellEnd"/>
       <w:r>
+        <w:rPr>
+          <w:rFonts w:ascii="Times New Roman" w:hAnsi="Times New Roman" w:cs="Times New Roman"/>
+        </w:rPr>
         <w:t xml:space="preserve"> </w:t>
       </w:r>
       <w:proofErr w:type="spellStart"/>
       <w:r>
+        <w:rPr>
+          <w:rFonts w:ascii="Times New Roman" w:hAnsi="Times New Roman" w:cs="Times New Roman"/>
+        </w:rPr>
         <w:t>số</w:t>
       </w:r>
       <w:proofErr w:type="spellEnd"/>
       <w:r>
+        <w:rPr>
+          <w:rFonts w:ascii="Times New Roman" w:hAnsi="Times New Roman" w:cs="Times New Roman"/>
+        </w:rPr>
         <w:t xml:space="preserve"> 3 - Google Docs</w:t>
       </w:r>
-      <w:bookmarkEnd w:id="5"/>
-    </w:p>
-    <w:bookmarkStart w:id="6" w:name="_MON_1852280629"/>
-    <w:bookmarkEnd w:id="6"/>
+      <w:bookmarkEnd w:id="15"/>
+    </w:p>
+    <w:bookmarkStart w:id="16" w:name="_MON_1852280629"/>
+    <w:bookmarkEnd w:id="16"/>
     <w:p>
       <w:pPr>
         <w:jc w:val="center"/>
         <w:rPr>
-          <w:lang w:val="vi-VN"/>
-        </w:rPr>
-      </w:pPr>
-      <w:r>
-        <w:rPr>
+          <w:rFonts w:ascii="Times New Roman" w:hAnsi="Times New Roman" w:cs="Times New Roman"/>
+          <w:lang w:val="vi-VN"/>
+        </w:rPr>
+      </w:pPr>
+      <w:r>
+        <w:rPr>
+          <w:rFonts w:ascii="Times New Roman" w:hAnsi="Times New Roman" w:cs="Times New Roman"/>
           <w:lang w:val="vi-VN"/>
         </w:rPr>
         <w:object w:dxaOrig="1520" w:dyaOrig="989" w14:anchorId="5D0408D3">
           <v:shape id="_x0000_i1036" type="#_x0000_t75" style="width:76.2pt;height:49.2pt" o:ole="">
-            <v:imagedata r:id="rId12" o:title=""/>
+            <v:imagedata r:id="rId13" o:title=""/>
           </v:shape>
-          <o:OLEObject Type="Embed" ProgID="Word.Document.12" ShapeID="_x0000_i1036" DrawAspect="Icon" ObjectID="_1852281180" r:id="rId13">
+          <o:OLEObject Type="Embed" ProgID="Word.Document.12" ShapeID="_x0000_i1036" DrawAspect="Icon" ObjectID="_1852281847" r:id="rId14">
             <o:FieldCodes>\s</o:FieldCodes>
           </o:OLEObject>
         </w:object>
@@ -1849,143 +2303,308 @@
     <w:p>
       <w:pPr>
         <w:rPr>
-          <w:lang w:val="vi-VN"/>
-        </w:rPr>
-      </w:pPr>
-    </w:p>
-    <w:p>
-      <w:r>
+          <w:rFonts w:ascii="Times New Roman" w:hAnsi="Times New Roman" w:cs="Times New Roman"/>
+          <w:lang w:val="vi-VN"/>
+        </w:rPr>
+      </w:pPr>
+    </w:p>
+    <w:p>
+      <w:pPr>
+        <w:rPr>
+          <w:rFonts w:ascii="Times New Roman" w:hAnsi="Times New Roman" w:cs="Times New Roman"/>
+          <w:sz w:val="24"/>
+          <w:szCs w:val="24"/>
+        </w:rPr>
+      </w:pPr>
+      <w:r>
+        <w:rPr>
+          <w:rFonts w:ascii="Times New Roman" w:hAnsi="Times New Roman" w:cs="Times New Roman"/>
+          <w:sz w:val="24"/>
+          <w:szCs w:val="24"/>
+        </w:rPr>
         <w:t xml:space="preserve">-Meeting </w:t>
       </w:r>
       <w:proofErr w:type="spellStart"/>
       <w:r>
+        <w:rPr>
+          <w:rFonts w:ascii="Times New Roman" w:hAnsi="Times New Roman" w:cs="Times New Roman"/>
+          <w:sz w:val="24"/>
+          <w:szCs w:val="24"/>
+        </w:rPr>
         <w:t>thảo</w:t>
       </w:r>
       <w:proofErr w:type="spellEnd"/>
       <w:r>
+        <w:rPr>
+          <w:rFonts w:ascii="Times New Roman" w:hAnsi="Times New Roman" w:cs="Times New Roman"/>
+          <w:sz w:val="24"/>
+          <w:szCs w:val="24"/>
+        </w:rPr>
         <w:t xml:space="preserve"> </w:t>
       </w:r>
       <w:proofErr w:type="spellStart"/>
       <w:r>
+        <w:rPr>
+          <w:rFonts w:ascii="Times New Roman" w:hAnsi="Times New Roman" w:cs="Times New Roman"/>
+          <w:sz w:val="24"/>
+          <w:szCs w:val="24"/>
+        </w:rPr>
         <w:t>luận</w:t>
       </w:r>
       <w:proofErr w:type="spellEnd"/>
       <w:r>
+        <w:rPr>
+          <w:rFonts w:ascii="Times New Roman" w:hAnsi="Times New Roman" w:cs="Times New Roman"/>
+          <w:sz w:val="24"/>
+          <w:szCs w:val="24"/>
+        </w:rPr>
         <w:t xml:space="preserve"> </w:t>
       </w:r>
       <w:proofErr w:type="spellStart"/>
       <w:r>
+        <w:rPr>
+          <w:rFonts w:ascii="Times New Roman" w:hAnsi="Times New Roman" w:cs="Times New Roman"/>
+          <w:sz w:val="24"/>
+          <w:szCs w:val="24"/>
+        </w:rPr>
         <w:t>sửa</w:t>
       </w:r>
       <w:proofErr w:type="spellEnd"/>
       <w:r>
+        <w:rPr>
+          <w:rFonts w:ascii="Times New Roman" w:hAnsi="Times New Roman" w:cs="Times New Roman"/>
+          <w:sz w:val="24"/>
+          <w:szCs w:val="24"/>
+        </w:rPr>
         <w:t xml:space="preserve"> </w:t>
       </w:r>
       <w:proofErr w:type="spellStart"/>
       <w:r>
+        <w:rPr>
+          <w:rFonts w:ascii="Times New Roman" w:hAnsi="Times New Roman" w:cs="Times New Roman"/>
+          <w:sz w:val="24"/>
+          <w:szCs w:val="24"/>
+        </w:rPr>
         <w:t>nội</w:t>
       </w:r>
       <w:proofErr w:type="spellEnd"/>
       <w:r>
+        <w:rPr>
+          <w:rFonts w:ascii="Times New Roman" w:hAnsi="Times New Roman" w:cs="Times New Roman"/>
+          <w:sz w:val="24"/>
+          <w:szCs w:val="24"/>
+        </w:rPr>
         <w:t xml:space="preserve"> dung “Ban </w:t>
       </w:r>
       <w:proofErr w:type="spellStart"/>
       <w:r>
+        <w:rPr>
+          <w:rFonts w:ascii="Times New Roman" w:hAnsi="Times New Roman" w:cs="Times New Roman"/>
+          <w:sz w:val="24"/>
+          <w:szCs w:val="24"/>
+        </w:rPr>
         <w:t>Giám</w:t>
       </w:r>
       <w:proofErr w:type="spellEnd"/>
       <w:r>
+        <w:rPr>
+          <w:rFonts w:ascii="Times New Roman" w:hAnsi="Times New Roman" w:cs="Times New Roman"/>
+          <w:sz w:val="24"/>
+          <w:szCs w:val="24"/>
+        </w:rPr>
         <w:t xml:space="preserve"> </w:t>
       </w:r>
       <w:proofErr w:type="spellStart"/>
       <w:r>
+        <w:rPr>
+          <w:rFonts w:ascii="Times New Roman" w:hAnsi="Times New Roman" w:cs="Times New Roman"/>
+          <w:sz w:val="24"/>
+          <w:szCs w:val="24"/>
+        </w:rPr>
         <w:t>hiệu</w:t>
       </w:r>
       <w:proofErr w:type="spellEnd"/>
       <w:r>
+        <w:rPr>
+          <w:rFonts w:ascii="Times New Roman" w:hAnsi="Times New Roman" w:cs="Times New Roman"/>
+          <w:sz w:val="24"/>
+          <w:szCs w:val="24"/>
+        </w:rPr>
         <w:t xml:space="preserve"> Trường </w:t>
       </w:r>
       <w:proofErr w:type="spellStart"/>
       <w:r>
+        <w:rPr>
+          <w:rFonts w:ascii="Times New Roman" w:hAnsi="Times New Roman" w:cs="Times New Roman"/>
+          <w:sz w:val="24"/>
+          <w:szCs w:val="24"/>
+        </w:rPr>
         <w:t>Đại</w:t>
       </w:r>
       <w:proofErr w:type="spellEnd"/>
       <w:r>
+        <w:rPr>
+          <w:rFonts w:ascii="Times New Roman" w:hAnsi="Times New Roman" w:cs="Times New Roman"/>
+          <w:sz w:val="24"/>
+          <w:szCs w:val="24"/>
+        </w:rPr>
         <w:t xml:space="preserve"> </w:t>
       </w:r>
       <w:proofErr w:type="spellStart"/>
       <w:r>
+        <w:rPr>
+          <w:rFonts w:ascii="Times New Roman" w:hAnsi="Times New Roman" w:cs="Times New Roman"/>
+          <w:sz w:val="24"/>
+          <w:szCs w:val="24"/>
+        </w:rPr>
         <w:t>học</w:t>
       </w:r>
       <w:proofErr w:type="spellEnd"/>
       <w:r>
+        <w:rPr>
+          <w:rFonts w:ascii="Times New Roman" w:hAnsi="Times New Roman" w:cs="Times New Roman"/>
+          <w:sz w:val="24"/>
+          <w:szCs w:val="24"/>
+        </w:rPr>
         <w:t xml:space="preserve"> </w:t>
       </w:r>
       <w:proofErr w:type="spellStart"/>
       <w:r>
+        <w:rPr>
+          <w:rFonts w:ascii="Times New Roman" w:hAnsi="Times New Roman" w:cs="Times New Roman"/>
+          <w:sz w:val="24"/>
+          <w:szCs w:val="24"/>
+        </w:rPr>
         <w:t>Cần</w:t>
       </w:r>
       <w:proofErr w:type="spellEnd"/>
       <w:r>
+        <w:rPr>
+          <w:rFonts w:ascii="Times New Roman" w:hAnsi="Times New Roman" w:cs="Times New Roman"/>
+          <w:sz w:val="24"/>
+          <w:szCs w:val="24"/>
+        </w:rPr>
         <w:t xml:space="preserve"> Thơ” </w:t>
       </w:r>
       <w:proofErr w:type="spellStart"/>
       <w:r>
+        <w:rPr>
+          <w:rFonts w:ascii="Times New Roman" w:hAnsi="Times New Roman" w:cs="Times New Roman"/>
+          <w:sz w:val="24"/>
+          <w:szCs w:val="24"/>
+        </w:rPr>
         <w:t>thành</w:t>
       </w:r>
       <w:proofErr w:type="spellEnd"/>
       <w:r>
+        <w:rPr>
+          <w:rFonts w:ascii="Times New Roman" w:hAnsi="Times New Roman" w:cs="Times New Roman"/>
+          <w:sz w:val="24"/>
+          <w:szCs w:val="24"/>
+        </w:rPr>
         <w:t xml:space="preserve"> “Ban </w:t>
       </w:r>
       <w:proofErr w:type="spellStart"/>
       <w:r>
+        <w:rPr>
+          <w:rFonts w:ascii="Times New Roman" w:hAnsi="Times New Roman" w:cs="Times New Roman"/>
+          <w:sz w:val="24"/>
+          <w:szCs w:val="24"/>
+        </w:rPr>
         <w:t>Giám</w:t>
       </w:r>
       <w:proofErr w:type="spellEnd"/>
       <w:r>
+        <w:rPr>
+          <w:rFonts w:ascii="Times New Roman" w:hAnsi="Times New Roman" w:cs="Times New Roman"/>
+          <w:sz w:val="24"/>
+          <w:szCs w:val="24"/>
+        </w:rPr>
         <w:t xml:space="preserve"> </w:t>
       </w:r>
       <w:proofErr w:type="spellStart"/>
       <w:r>
+        <w:rPr>
+          <w:rFonts w:ascii="Times New Roman" w:hAnsi="Times New Roman" w:cs="Times New Roman"/>
+          <w:sz w:val="24"/>
+          <w:szCs w:val="24"/>
+        </w:rPr>
         <w:t>hiệu</w:t>
       </w:r>
       <w:proofErr w:type="spellEnd"/>
       <w:r>
+        <w:rPr>
+          <w:rFonts w:ascii="Times New Roman" w:hAnsi="Times New Roman" w:cs="Times New Roman"/>
+          <w:sz w:val="24"/>
+          <w:szCs w:val="24"/>
+        </w:rPr>
         <w:t xml:space="preserve"> </w:t>
       </w:r>
       <w:proofErr w:type="spellStart"/>
       <w:r>
+        <w:rPr>
+          <w:rFonts w:ascii="Times New Roman" w:hAnsi="Times New Roman" w:cs="Times New Roman"/>
+          <w:sz w:val="24"/>
+          <w:szCs w:val="24"/>
+        </w:rPr>
         <w:t>Đại</w:t>
       </w:r>
       <w:proofErr w:type="spellEnd"/>
       <w:r>
+        <w:rPr>
+          <w:rFonts w:ascii="Times New Roman" w:hAnsi="Times New Roman" w:cs="Times New Roman"/>
+          <w:sz w:val="24"/>
+          <w:szCs w:val="24"/>
+        </w:rPr>
         <w:t xml:space="preserve"> </w:t>
       </w:r>
       <w:proofErr w:type="spellStart"/>
       <w:r>
+        <w:rPr>
+          <w:rFonts w:ascii="Times New Roman" w:hAnsi="Times New Roman" w:cs="Times New Roman"/>
+          <w:sz w:val="24"/>
+          <w:szCs w:val="24"/>
+        </w:rPr>
         <w:t>học</w:t>
       </w:r>
       <w:proofErr w:type="spellEnd"/>
       <w:r>
+        <w:rPr>
+          <w:rFonts w:ascii="Times New Roman" w:hAnsi="Times New Roman" w:cs="Times New Roman"/>
+          <w:sz w:val="24"/>
+          <w:szCs w:val="24"/>
+        </w:rPr>
         <w:t xml:space="preserve"> </w:t>
       </w:r>
       <w:proofErr w:type="spellStart"/>
       <w:r>
+        <w:rPr>
+          <w:rFonts w:ascii="Times New Roman" w:hAnsi="Times New Roman" w:cs="Times New Roman"/>
+          <w:sz w:val="24"/>
+          <w:szCs w:val="24"/>
+        </w:rPr>
         <w:t>Cần</w:t>
       </w:r>
       <w:proofErr w:type="spellEnd"/>
       <w:r>
+        <w:rPr>
+          <w:rFonts w:ascii="Times New Roman" w:hAnsi="Times New Roman" w:cs="Times New Roman"/>
+          <w:sz w:val="24"/>
+          <w:szCs w:val="24"/>
+        </w:rPr>
         <w:t xml:space="preserve"> Thơ”.</w:t>
       </w:r>
     </w:p>
     <w:p>
       <w:pPr>
         <w:rPr>
-          <w:lang w:val="vi-VN"/>
-        </w:rPr>
-      </w:pPr>
-      <w:r>
-        <w:rPr>
+          <w:rFonts w:ascii="Times New Roman" w:hAnsi="Times New Roman" w:cs="Times New Roman"/>
+          <w:lang w:val="vi-VN"/>
+        </w:rPr>
+      </w:pPr>
+      <w:r>
+        <w:rPr>
+          <w:rFonts w:ascii="Times New Roman" w:hAnsi="Times New Roman" w:cs="Times New Roman"/>
           <w:noProof/>
         </w:rPr>
         <w:drawing>
@@ -2006,7 +2625,7 @@
                     </pic:cNvPicPr>
                   </pic:nvPicPr>
                   <pic:blipFill>
-                    <a:blip r:embed="rId14" cstate="print">
+                    <a:blip r:embed="rId15" cstate="print">
                       <a:extLst>
                         <a:ext uri="{28A0092B-C50C-407E-A947-70E740481C1C}">
                           <a14:useLocalDpi xmlns:a14="http://schemas.microsoft.com/office/drawing/2010/main" val="0"/>
@@ -2041,120 +2660,235 @@
     <w:p>
       <w:pPr>
         <w:rPr>
-          <w:lang w:val="vi-VN"/>
-        </w:rPr>
-      </w:pPr>
-    </w:p>
-    <w:p>
-      <w:pPr>
-        <w:rPr>
-          <w:lang w:val="vi-VN"/>
-        </w:rPr>
-      </w:pPr>
-    </w:p>
-    <w:p>
-      <w:pPr>
-        <w:rPr>
-          <w:lang w:val="vi-VN"/>
-        </w:rPr>
-      </w:pPr>
-    </w:p>
-    <w:p>
-      <w:pPr>
-        <w:rPr>
-          <w:lang w:val="vi-VN"/>
-        </w:rPr>
-      </w:pPr>
-    </w:p>
-    <w:p>
-      <w:pPr>
-        <w:rPr>
-          <w:lang w:val="vi-VN"/>
-        </w:rPr>
-      </w:pPr>
-    </w:p>
-    <w:p>
-      <w:pPr>
-        <w:rPr>
-          <w:lang w:val="vi-VN"/>
-        </w:rPr>
-      </w:pPr>
-    </w:p>
-    <w:p>
-      <w:r>
-        <w:lastRenderedPageBreak/>
+          <w:rFonts w:ascii="Times New Roman" w:hAnsi="Times New Roman" w:cs="Times New Roman"/>
+          <w:lang w:val="vi-VN"/>
+        </w:rPr>
+      </w:pPr>
+    </w:p>
+    <w:p>
+      <w:pPr>
+        <w:rPr>
+          <w:rFonts w:ascii="Times New Roman" w:hAnsi="Times New Roman" w:cs="Times New Roman"/>
+          <w:lang w:val="vi-VN"/>
+        </w:rPr>
+      </w:pPr>
+    </w:p>
+    <w:p>
+      <w:pPr>
+        <w:rPr>
+          <w:rFonts w:ascii="Times New Roman" w:hAnsi="Times New Roman" w:cs="Times New Roman"/>
+          <w:lang w:val="vi-VN"/>
+        </w:rPr>
+      </w:pPr>
+    </w:p>
+    <w:p>
+      <w:pPr>
+        <w:rPr>
+          <w:rFonts w:ascii="Times New Roman" w:hAnsi="Times New Roman" w:cs="Times New Roman"/>
+          <w:lang w:val="vi-VN"/>
+        </w:rPr>
+      </w:pPr>
+    </w:p>
+    <w:p>
+      <w:pPr>
+        <w:rPr>
+          <w:rFonts w:ascii="Times New Roman" w:hAnsi="Times New Roman" w:cs="Times New Roman"/>
+          <w:lang w:val="vi-VN"/>
+        </w:rPr>
+      </w:pPr>
+    </w:p>
+    <w:p>
+      <w:pPr>
+        <w:rPr>
+          <w:rFonts w:ascii="Times New Roman" w:hAnsi="Times New Roman" w:cs="Times New Roman"/>
+          <w:lang w:val="vi-VN"/>
+        </w:rPr>
+      </w:pPr>
+    </w:p>
+    <w:p>
+      <w:pPr>
+        <w:rPr>
+          <w:rFonts w:ascii="Times New Roman" w:hAnsi="Times New Roman" w:cs="Times New Roman"/>
+          <w:lang w:val="vi-VN"/>
+        </w:rPr>
+      </w:pPr>
+    </w:p>
+    <w:p>
+      <w:pPr>
+        <w:rPr>
+          <w:rFonts w:ascii="Times New Roman" w:hAnsi="Times New Roman" w:cs="Times New Roman"/>
+          <w:sz w:val="24"/>
+          <w:szCs w:val="24"/>
+        </w:rPr>
+      </w:pPr>
+      <w:r>
+        <w:rPr>
+          <w:rFonts w:ascii="Times New Roman" w:hAnsi="Times New Roman" w:cs="Times New Roman"/>
+          <w:sz w:val="24"/>
+          <w:szCs w:val="24"/>
+        </w:rPr>
         <w:t xml:space="preserve">-Xem </w:t>
       </w:r>
       <w:proofErr w:type="spellStart"/>
       <w:r>
+        <w:rPr>
+          <w:rFonts w:ascii="Times New Roman" w:hAnsi="Times New Roman" w:cs="Times New Roman"/>
+          <w:sz w:val="24"/>
+          <w:szCs w:val="24"/>
+        </w:rPr>
         <w:t>lại</w:t>
       </w:r>
       <w:proofErr w:type="spellEnd"/>
       <w:r>
+        <w:rPr>
+          <w:rFonts w:ascii="Times New Roman" w:hAnsi="Times New Roman" w:cs="Times New Roman"/>
+          <w:sz w:val="24"/>
+          <w:szCs w:val="24"/>
+        </w:rPr>
         <w:t xml:space="preserve"> </w:t>
       </w:r>
       <w:proofErr w:type="spellStart"/>
       <w:r>
+        <w:rPr>
+          <w:rFonts w:ascii="Times New Roman" w:hAnsi="Times New Roman" w:cs="Times New Roman"/>
+          <w:sz w:val="24"/>
+          <w:szCs w:val="24"/>
+        </w:rPr>
         <w:t>chức</w:t>
       </w:r>
       <w:proofErr w:type="spellEnd"/>
       <w:r>
+        <w:rPr>
+          <w:rFonts w:ascii="Times New Roman" w:hAnsi="Times New Roman" w:cs="Times New Roman"/>
+          <w:sz w:val="24"/>
+          <w:szCs w:val="24"/>
+        </w:rPr>
         <w:t xml:space="preserve"> </w:t>
       </w:r>
       <w:proofErr w:type="spellStart"/>
       <w:r>
+        <w:rPr>
+          <w:rFonts w:ascii="Times New Roman" w:hAnsi="Times New Roman" w:cs="Times New Roman"/>
+          <w:sz w:val="24"/>
+          <w:szCs w:val="24"/>
+        </w:rPr>
         <w:t>năng</w:t>
       </w:r>
       <w:proofErr w:type="spellEnd"/>
       <w:r>
+        <w:rPr>
+          <w:rFonts w:ascii="Times New Roman" w:hAnsi="Times New Roman" w:cs="Times New Roman"/>
+          <w:sz w:val="24"/>
+          <w:szCs w:val="24"/>
+        </w:rPr>
         <w:t xml:space="preserve"> History </w:t>
       </w:r>
       <w:proofErr w:type="spellStart"/>
       <w:r>
+        <w:rPr>
+          <w:rFonts w:ascii="Times New Roman" w:hAnsi="Times New Roman" w:cs="Times New Roman"/>
+          <w:sz w:val="24"/>
+          <w:szCs w:val="24"/>
+        </w:rPr>
         <w:t>xem</w:t>
       </w:r>
       <w:proofErr w:type="spellEnd"/>
       <w:r>
+        <w:rPr>
+          <w:rFonts w:ascii="Times New Roman" w:hAnsi="Times New Roman" w:cs="Times New Roman"/>
+          <w:sz w:val="24"/>
+          <w:szCs w:val="24"/>
+        </w:rPr>
         <w:t xml:space="preserve"> </w:t>
       </w:r>
       <w:proofErr w:type="spellStart"/>
       <w:r>
+        <w:rPr>
+          <w:rFonts w:ascii="Times New Roman" w:hAnsi="Times New Roman" w:cs="Times New Roman"/>
+          <w:sz w:val="24"/>
+          <w:szCs w:val="24"/>
+        </w:rPr>
         <w:t>lại</w:t>
       </w:r>
       <w:proofErr w:type="spellEnd"/>
       <w:r>
+        <w:rPr>
+          <w:rFonts w:ascii="Times New Roman" w:hAnsi="Times New Roman" w:cs="Times New Roman"/>
+          <w:sz w:val="24"/>
+          <w:szCs w:val="24"/>
+        </w:rPr>
         <w:t xml:space="preserve"> </w:t>
       </w:r>
       <w:proofErr w:type="spellStart"/>
       <w:r>
+        <w:rPr>
+          <w:rFonts w:ascii="Times New Roman" w:hAnsi="Times New Roman" w:cs="Times New Roman"/>
+          <w:sz w:val="24"/>
+          <w:szCs w:val="24"/>
+        </w:rPr>
         <w:t>các</w:t>
       </w:r>
       <w:proofErr w:type="spellEnd"/>
       <w:r>
+        <w:rPr>
+          <w:rFonts w:ascii="Times New Roman" w:hAnsi="Times New Roman" w:cs="Times New Roman"/>
+          <w:sz w:val="24"/>
+          <w:szCs w:val="24"/>
+        </w:rPr>
         <w:t xml:space="preserve"> </w:t>
       </w:r>
       <w:proofErr w:type="spellStart"/>
       <w:r>
+        <w:rPr>
+          <w:rFonts w:ascii="Times New Roman" w:hAnsi="Times New Roman" w:cs="Times New Roman"/>
+          <w:sz w:val="24"/>
+          <w:szCs w:val="24"/>
+        </w:rPr>
         <w:t>chỉnh</w:t>
       </w:r>
       <w:proofErr w:type="spellEnd"/>
       <w:r>
+        <w:rPr>
+          <w:rFonts w:ascii="Times New Roman" w:hAnsi="Times New Roman" w:cs="Times New Roman"/>
+          <w:sz w:val="24"/>
+          <w:szCs w:val="24"/>
+        </w:rPr>
         <w:t xml:space="preserve"> </w:t>
       </w:r>
       <w:proofErr w:type="spellStart"/>
       <w:r>
+        <w:rPr>
+          <w:rFonts w:ascii="Times New Roman" w:hAnsi="Times New Roman" w:cs="Times New Roman"/>
+          <w:sz w:val="24"/>
+          <w:szCs w:val="24"/>
+        </w:rPr>
         <w:t>sửa</w:t>
       </w:r>
       <w:proofErr w:type="spellEnd"/>
       <w:r>
+        <w:rPr>
+          <w:rFonts w:ascii="Times New Roman" w:hAnsi="Times New Roman" w:cs="Times New Roman"/>
+          <w:sz w:val="24"/>
+          <w:szCs w:val="24"/>
+        </w:rPr>
         <w:t xml:space="preserve"> </w:t>
       </w:r>
       <w:proofErr w:type="spellStart"/>
       <w:r>
+        <w:rPr>
+          <w:rFonts w:ascii="Times New Roman" w:hAnsi="Times New Roman" w:cs="Times New Roman"/>
+          <w:sz w:val="24"/>
+          <w:szCs w:val="24"/>
+        </w:rPr>
         <w:t>trước</w:t>
       </w:r>
       <w:proofErr w:type="spellEnd"/>
       <w:r>
+        <w:rPr>
+          <w:rFonts w:ascii="Times New Roman" w:hAnsi="Times New Roman" w:cs="Times New Roman"/>
+          <w:sz w:val="24"/>
+          <w:szCs w:val="24"/>
+        </w:rPr>
         <w:t xml:space="preserve"> đây</w:t>
       </w:r>
     </w:p>
@@ -2162,12 +2896,13 @@
       <w:pPr>
         <w:rPr>
           <w:rStyle w:val="Heading1Char"/>
-          <w:lang w:val="vi-VN"/>
-        </w:rPr>
-      </w:pPr>
-      <w:r>
-        <w:rPr>
-          <w:rFonts w:ascii="Arial" w:hAnsi="Arial" w:cs="Arial"/>
+          <w:rFonts w:ascii="Times New Roman" w:hAnsi="Times New Roman" w:cs="Times New Roman"/>
+          <w:lang w:val="vi-VN"/>
+        </w:rPr>
+      </w:pPr>
+      <w:r>
+        <w:rPr>
+          <w:rFonts w:ascii="Times New Roman" w:hAnsi="Times New Roman" w:cs="Times New Roman"/>
           <w:noProof/>
           <w:color w:val="000000"/>
           <w:sz w:val="36"/>
@@ -2191,7 +2926,7 @@
                     </pic:cNvPicPr>
                   </pic:nvPicPr>
                   <pic:blipFill>
-                    <a:blip r:embed="rId15">
+                    <a:blip r:embed="rId16">
                       <a:extLst>
                         <a:ext uri="{28A0092B-C50C-407E-A947-70E740481C1C}">
                           <a14:useLocalDpi xmlns:a14="http://schemas.microsoft.com/office/drawing/2010/main" val="0"/>
@@ -2225,20 +2960,24 @@
     </w:p>
     <w:p>
       <w:pPr>
+        <w:jc w:val="center"/>
         <w:rPr>
           <w:rStyle w:val="Heading1Char"/>
-        </w:rPr>
-      </w:pPr>
-      <w:bookmarkStart w:id="7" w:name="_Toc241667528"/>
+          <w:rFonts w:ascii="Times New Roman" w:hAnsi="Times New Roman" w:cs="Times New Roman"/>
+        </w:rPr>
+      </w:pPr>
+      <w:bookmarkStart w:id="17" w:name="_Toc241668996"/>
       <w:r>
         <w:rPr>
           <w:rStyle w:val="Heading1Char"/>
+          <w:rFonts w:ascii="Times New Roman" w:hAnsi="Times New Roman" w:cs="Times New Roman"/>
         </w:rPr>
         <w:t>Lab</w:t>
       </w:r>
       <w:r>
         <w:rPr>
           <w:rStyle w:val="Heading1Char"/>
+          <w:rFonts w:ascii="Times New Roman" w:hAnsi="Times New Roman" w:cs="Times New Roman"/>
           <w:lang w:val="vi-VN"/>
         </w:rPr>
         <w:t xml:space="preserve"> </w:t>
@@ -2246,12 +2985,14 @@
       <w:r>
         <w:rPr>
           <w:rStyle w:val="Heading1Char"/>
+          <w:rFonts w:ascii="Times New Roman" w:hAnsi="Times New Roman" w:cs="Times New Roman"/>
         </w:rPr>
         <w:t>03</w:t>
       </w:r>
       <w:r>
         <w:rPr>
           <w:rStyle w:val="Heading1Char"/>
+          <w:rFonts w:ascii="Times New Roman" w:hAnsi="Times New Roman" w:cs="Times New Roman"/>
           <w:lang w:val="vi-VN"/>
         </w:rPr>
         <w:t xml:space="preserve">: </w:t>
@@ -2259,6 +3000,7 @@
       <w:r>
         <w:rPr>
           <w:rStyle w:val="Heading1Char"/>
+          <w:rFonts w:ascii="Times New Roman" w:hAnsi="Times New Roman" w:cs="Times New Roman"/>
         </w:rPr>
         <w:t xml:space="preserve">Microsoft Excel </w:t>
       </w:r>
@@ -2266,6 +3008,7 @@
       <w:r>
         <w:rPr>
           <w:rStyle w:val="Heading1Char"/>
+          <w:rFonts w:ascii="Times New Roman" w:hAnsi="Times New Roman" w:cs="Times New Roman"/>
         </w:rPr>
         <w:t>và</w:t>
       </w:r>
@@ -2273,161 +3016,303 @@
       <w:r>
         <w:rPr>
           <w:rStyle w:val="Heading1Char"/>
+          <w:rFonts w:ascii="Times New Roman" w:hAnsi="Times New Roman" w:cs="Times New Roman"/>
         </w:rPr>
         <w:t xml:space="preserve"> Google Sheets</w:t>
       </w:r>
-      <w:bookmarkEnd w:id="7"/>
+      <w:bookmarkEnd w:id="17"/>
     </w:p>
     <w:p>
       <w:pPr>
         <w:pStyle w:val="Heading2"/>
-        <w:rPr>
-          <w:lang w:val="vi-VN"/>
-        </w:rPr>
-      </w:pPr>
-      <w:bookmarkStart w:id="8" w:name="_Toc241667529"/>
-      <w:r>
+        <w:numPr>
+          <w:ilvl w:val="1"/>
+          <w:numId w:val="5"/>
+        </w:numPr>
+        <w:rPr>
+          <w:rFonts w:ascii="Times New Roman" w:hAnsi="Times New Roman" w:cs="Times New Roman"/>
+          <w:lang w:val="vi-VN"/>
+        </w:rPr>
+      </w:pPr>
+      <w:bookmarkStart w:id="18" w:name="_Toc241668997"/>
+      <w:r>
+        <w:rPr>
+          <w:rFonts w:ascii="Times New Roman" w:hAnsi="Times New Roman" w:cs="Times New Roman"/>
+        </w:rPr>
         <w:t>Microsoft Excel</w:t>
       </w:r>
-      <w:bookmarkEnd w:id="8"/>
+      <w:bookmarkEnd w:id="18"/>
     </w:p>
     <w:p>
       <w:pPr>
         <w:jc w:val="center"/>
         <w:rPr>
-          <w:lang w:val="vi-VN"/>
-        </w:rPr>
-      </w:pPr>
-      <w:r>
-        <w:rPr>
+          <w:rFonts w:ascii="Times New Roman" w:hAnsi="Times New Roman" w:cs="Times New Roman"/>
+          <w:lang w:val="vi-VN"/>
+        </w:rPr>
+      </w:pPr>
+      <w:r>
+        <w:rPr>
+          <w:rFonts w:ascii="Times New Roman" w:hAnsi="Times New Roman" w:cs="Times New Roman"/>
           <w:lang w:val="vi-VN"/>
         </w:rPr>
         <w:object w:dxaOrig="1520" w:dyaOrig="989" w14:anchorId="7A6883C5">
           <v:shape id="_x0000_i1037" type="#_x0000_t75" style="width:76.2pt;height:49.2pt" o:ole="">
-            <v:imagedata r:id="rId16" o:title=""/>
+            <v:imagedata r:id="rId17" o:title=""/>
           </v:shape>
-          <o:OLEObject Type="Embed" ProgID="Excel.Sheet.12" ShapeID="_x0000_i1037" DrawAspect="Icon" ObjectID="_1852281181" r:id="rId17"/>
+          <o:OLEObject Type="Embed" ProgID="Excel.Sheet.12" ShapeID="_x0000_i1037" DrawAspect="Icon" ObjectID="_1852281848" r:id="rId18"/>
         </w:object>
       </w:r>
     </w:p>
     <w:p>
       <w:pPr>
+        <w:pStyle w:val="ListParagraph"/>
+        <w:keepNext/>
+        <w:keepLines/>
+        <w:numPr>
+          <w:ilvl w:val="0"/>
+          <w:numId w:val="6"/>
+        </w:numPr>
+        <w:spacing w:before="40" w:after="0"/>
+        <w:contextualSpacing w:val="0"/>
+        <w:outlineLvl w:val="1"/>
+        <w:rPr>
+          <w:rFonts w:ascii="Times New Roman" w:eastAsiaTheme="majorEastAsia" w:hAnsi="Times New Roman" w:cs="Times New Roman"/>
+          <w:vanish/>
+          <w:color w:val="2E74B5" w:themeColor="accent1" w:themeShade="BF"/>
+          <w:sz w:val="26"/>
+          <w:szCs w:val="26"/>
+        </w:rPr>
+      </w:pPr>
+      <w:bookmarkStart w:id="19" w:name="_Toc241668970"/>
+      <w:bookmarkStart w:id="20" w:name="_Toc241668998"/>
+      <w:bookmarkEnd w:id="19"/>
+      <w:bookmarkEnd w:id="20"/>
+    </w:p>
+    <w:p>
+      <w:pPr>
+        <w:pStyle w:val="ListParagraph"/>
+        <w:keepNext/>
+        <w:keepLines/>
+        <w:numPr>
+          <w:ilvl w:val="1"/>
+          <w:numId w:val="6"/>
+        </w:numPr>
+        <w:spacing w:before="40" w:after="0"/>
+        <w:contextualSpacing w:val="0"/>
+        <w:outlineLvl w:val="1"/>
+        <w:rPr>
+          <w:rFonts w:ascii="Times New Roman" w:eastAsiaTheme="majorEastAsia" w:hAnsi="Times New Roman" w:cs="Times New Roman"/>
+          <w:vanish/>
+          <w:color w:val="2E74B5" w:themeColor="accent1" w:themeShade="BF"/>
+          <w:sz w:val="26"/>
+          <w:szCs w:val="26"/>
+        </w:rPr>
+      </w:pPr>
+      <w:bookmarkStart w:id="21" w:name="_Toc241668971"/>
+      <w:bookmarkStart w:id="22" w:name="_Toc241668999"/>
+      <w:bookmarkEnd w:id="21"/>
+      <w:bookmarkEnd w:id="22"/>
+    </w:p>
+    <w:p>
+      <w:pPr>
         <w:pStyle w:val="Heading2"/>
-        <w:rPr>
-          <w:lang w:val="vi-VN"/>
-        </w:rPr>
-      </w:pPr>
-      <w:bookmarkStart w:id="9" w:name="_Toc241667530"/>
-      <w:r>
+        <w:numPr>
+          <w:ilvl w:val="1"/>
+          <w:numId w:val="6"/>
+        </w:numPr>
+        <w:rPr>
+          <w:rFonts w:ascii="Times New Roman" w:hAnsi="Times New Roman" w:cs="Times New Roman"/>
+          <w:lang w:val="vi-VN"/>
+        </w:rPr>
+      </w:pPr>
+      <w:bookmarkStart w:id="23" w:name="_Toc241669000"/>
+      <w:r>
+        <w:rPr>
+          <w:rFonts w:ascii="Times New Roman" w:hAnsi="Times New Roman" w:cs="Times New Roman"/>
+        </w:rPr>
         <w:t>Google Sheet</w:t>
       </w:r>
-      <w:bookmarkEnd w:id="9"/>
-    </w:p>
-    <w:p>
-      <w:pPr>
-        <w:pStyle w:val="Heading2"/>
+      <w:bookmarkEnd w:id="23"/>
+    </w:p>
+    <w:p>
+      <w:pPr>
         <w:jc w:val="center"/>
       </w:pPr>
       <w:r>
         <w:object w:dxaOrig="1520" w:dyaOrig="989" w14:anchorId="0290530C">
           <v:shape id="_x0000_i1038" type="#_x0000_t75" style="width:76.2pt;height:49.2pt" o:ole="">
-            <v:imagedata r:id="rId18" o:title=""/>
+            <v:imagedata r:id="rId19" o:title=""/>
           </v:shape>
-          <o:OLEObject Type="Embed" ProgID="Excel.Sheet.12" ShapeID="_x0000_i1038" DrawAspect="Icon" ObjectID="_1852281182" r:id="rId19"/>
+          <o:OLEObject Type="Embed" ProgID="Excel.Sheet.12" ShapeID="_x0000_i1038" DrawAspect="Icon" ObjectID="_1852281849" r:id="rId20"/>
         </w:object>
       </w:r>
     </w:p>
     <w:p>
       <w:pPr>
         <w:pStyle w:val="Heading1"/>
-      </w:pPr>
-      <w:bookmarkStart w:id="10" w:name="_Toc241667531"/>
-      <w:r>
+        <w:jc w:val="center"/>
+        <w:rPr>
+          <w:rFonts w:ascii="Times New Roman" w:hAnsi="Times New Roman" w:cs="Times New Roman"/>
+        </w:rPr>
+      </w:pPr>
+      <w:bookmarkStart w:id="24" w:name="_Toc241669001"/>
+      <w:r>
+        <w:rPr>
+          <w:rFonts w:ascii="Times New Roman" w:hAnsi="Times New Roman" w:cs="Times New Roman"/>
+        </w:rPr>
         <w:t>Lab</w:t>
       </w:r>
       <w:r>
         <w:rPr>
+          <w:rFonts w:ascii="Times New Roman" w:hAnsi="Times New Roman" w:cs="Times New Roman"/>
           <w:lang w:val="vi-VN"/>
         </w:rPr>
         <w:t xml:space="preserve"> </w:t>
       </w:r>
       <w:r>
+        <w:rPr>
+          <w:rFonts w:ascii="Times New Roman" w:hAnsi="Times New Roman" w:cs="Times New Roman"/>
+        </w:rPr>
         <w:t>04</w:t>
       </w:r>
       <w:r>
         <w:rPr>
+          <w:rFonts w:ascii="Times New Roman" w:hAnsi="Times New Roman" w:cs="Times New Roman"/>
           <w:lang w:val="vi-VN"/>
         </w:rPr>
         <w:t>:</w:t>
       </w:r>
       <w:r>
+        <w:rPr>
+          <w:rFonts w:ascii="Times New Roman" w:hAnsi="Times New Roman" w:cs="Times New Roman"/>
+        </w:rPr>
         <w:t xml:space="preserve"> Microsoft </w:t>
       </w:r>
       <w:proofErr w:type="spellStart"/>
       <w:r>
+        <w:rPr>
+          <w:rFonts w:ascii="Times New Roman" w:hAnsi="Times New Roman" w:cs="Times New Roman"/>
+        </w:rPr>
         <w:t>Powerpoint</w:t>
       </w:r>
-      <w:bookmarkEnd w:id="10"/>
+      <w:bookmarkEnd w:id="24"/>
       <w:proofErr w:type="spellEnd"/>
     </w:p>
     <w:p>
       <w:pPr>
+        <w:pStyle w:val="ListParagraph"/>
+        <w:keepNext/>
+        <w:keepLines/>
+        <w:numPr>
+          <w:ilvl w:val="0"/>
+          <w:numId w:val="7"/>
+        </w:numPr>
+        <w:spacing w:before="40" w:after="0"/>
+        <w:contextualSpacing w:val="0"/>
+        <w:outlineLvl w:val="1"/>
+        <w:rPr>
+          <w:rFonts w:ascii="Times New Roman" w:eastAsiaTheme="majorEastAsia" w:hAnsi="Times New Roman" w:cs="Times New Roman"/>
+          <w:vanish/>
+          <w:color w:val="2E74B5" w:themeColor="accent1" w:themeShade="BF"/>
+          <w:sz w:val="26"/>
+          <w:szCs w:val="26"/>
+        </w:rPr>
+      </w:pPr>
+      <w:bookmarkStart w:id="25" w:name="_Toc241668975"/>
+      <w:bookmarkStart w:id="26" w:name="_Toc241669002"/>
+      <w:bookmarkEnd w:id="25"/>
+      <w:bookmarkEnd w:id="26"/>
+    </w:p>
+    <w:p>
+      <w:pPr>
         <w:pStyle w:val="Heading2"/>
-        <w:rPr>
-          <w:lang w:val="vi-VN"/>
-        </w:rPr>
-      </w:pPr>
-      <w:bookmarkStart w:id="11" w:name="_Toc241667532"/>
+        <w:numPr>
+          <w:ilvl w:val="1"/>
+          <w:numId w:val="7"/>
+        </w:numPr>
+        <w:rPr>
+          <w:rFonts w:ascii="Times New Roman" w:hAnsi="Times New Roman" w:cs="Times New Roman"/>
+          <w:lang w:val="vi-VN"/>
+        </w:rPr>
+      </w:pPr>
+      <w:bookmarkStart w:id="27" w:name="_Toc241669003"/>
       <w:proofErr w:type="spellStart"/>
       <w:r>
+        <w:rPr>
+          <w:rFonts w:ascii="Times New Roman" w:hAnsi="Times New Roman" w:cs="Times New Roman"/>
+        </w:rPr>
         <w:t>Bài</w:t>
       </w:r>
       <w:proofErr w:type="spellEnd"/>
       <w:r>
+        <w:rPr>
+          <w:rFonts w:ascii="Times New Roman" w:hAnsi="Times New Roman" w:cs="Times New Roman"/>
+        </w:rPr>
         <w:t xml:space="preserve"> </w:t>
       </w:r>
       <w:proofErr w:type="spellStart"/>
       <w:r>
+        <w:rPr>
+          <w:rFonts w:ascii="Times New Roman" w:hAnsi="Times New Roman" w:cs="Times New Roman"/>
+        </w:rPr>
         <w:t>thực</w:t>
       </w:r>
       <w:proofErr w:type="spellEnd"/>
       <w:r>
+        <w:rPr>
+          <w:rFonts w:ascii="Times New Roman" w:hAnsi="Times New Roman" w:cs="Times New Roman"/>
+        </w:rPr>
         <w:t xml:space="preserve"> </w:t>
       </w:r>
       <w:proofErr w:type="spellStart"/>
       <w:r>
+        <w:rPr>
+          <w:rFonts w:ascii="Times New Roman" w:hAnsi="Times New Roman" w:cs="Times New Roman"/>
+        </w:rPr>
         <w:t>hành</w:t>
       </w:r>
       <w:proofErr w:type="spellEnd"/>
       <w:r>
+        <w:rPr>
+          <w:rFonts w:ascii="Times New Roman" w:hAnsi="Times New Roman" w:cs="Times New Roman"/>
+        </w:rPr>
         <w:t xml:space="preserve"> </w:t>
       </w:r>
       <w:proofErr w:type="spellStart"/>
       <w:r>
+        <w:rPr>
+          <w:rFonts w:ascii="Times New Roman" w:hAnsi="Times New Roman" w:cs="Times New Roman"/>
+        </w:rPr>
         <w:t>số</w:t>
       </w:r>
       <w:proofErr w:type="spellEnd"/>
       <w:r>
+        <w:rPr>
+          <w:rFonts w:ascii="Times New Roman" w:hAnsi="Times New Roman" w:cs="Times New Roman"/>
+        </w:rPr>
         <w:t xml:space="preserve"> 1</w:t>
       </w:r>
-      <w:bookmarkEnd w:id="11"/>
+      <w:bookmarkEnd w:id="27"/>
     </w:p>
     <w:p>
       <w:pPr>
         <w:jc w:val="center"/>
         <w:rPr>
-          <w:lang w:val="vi-VN"/>
-        </w:rPr>
-      </w:pPr>
-      <w:r>
-        <w:rPr>
+          <w:rFonts w:ascii="Times New Roman" w:hAnsi="Times New Roman" w:cs="Times New Roman"/>
+          <w:lang w:val="vi-VN"/>
+        </w:rPr>
+      </w:pPr>
+      <w:r>
+        <w:rPr>
+          <w:rFonts w:ascii="Times New Roman" w:hAnsi="Times New Roman" w:cs="Times New Roman"/>
           <w:lang w:val="vi-VN"/>
         </w:rPr>
         <w:object w:dxaOrig="1520" w:dyaOrig="989" w14:anchorId="44B4A8C7">
           <v:shape id="_x0000_i1039" type="#_x0000_t75" style="width:76.2pt;height:49.2pt" o:ole="">
-            <v:imagedata r:id="rId20" o:title=""/>
+            <v:imagedata r:id="rId21" o:title=""/>
           </v:shape>
-          <o:OLEObject Type="Embed" ProgID="Package" ShapeID="_x0000_i1039" DrawAspect="Icon" ObjectID="_1852281183" r:id="rId21"/>
+          <o:OLEObject Type="Embed" ProgID="Package" ShapeID="_x0000_i1039" DrawAspect="Icon" ObjectID="_1852281850" r:id="rId22"/>
         </w:object>
       </w:r>
     </w:p>
@@ -2435,52 +3320,135 @@
       <w:pPr>
         <w:pStyle w:val="Heading2"/>
         <w:rPr>
-          <w:lang w:val="vi-VN"/>
-        </w:rPr>
-      </w:pPr>
-      <w:bookmarkStart w:id="12" w:name="_Toc241667533"/>
+          <w:rFonts w:ascii="Times New Roman" w:hAnsi="Times New Roman" w:cs="Times New Roman"/>
+          <w:lang w:val="vi-VN"/>
+        </w:rPr>
+      </w:pPr>
+    </w:p>
+    <w:p>
+      <w:pPr>
+        <w:pStyle w:val="ListParagraph"/>
+        <w:keepNext/>
+        <w:keepLines/>
+        <w:numPr>
+          <w:ilvl w:val="0"/>
+          <w:numId w:val="8"/>
+        </w:numPr>
+        <w:spacing w:before="40" w:after="0"/>
+        <w:contextualSpacing w:val="0"/>
+        <w:outlineLvl w:val="1"/>
+        <w:rPr>
+          <w:rFonts w:ascii="Times New Roman" w:eastAsiaTheme="majorEastAsia" w:hAnsi="Times New Roman" w:cs="Times New Roman"/>
+          <w:vanish/>
+          <w:color w:val="2E74B5" w:themeColor="accent1" w:themeShade="BF"/>
+          <w:sz w:val="26"/>
+          <w:szCs w:val="26"/>
+        </w:rPr>
+      </w:pPr>
+      <w:bookmarkStart w:id="28" w:name="_Toc241668977"/>
+      <w:bookmarkStart w:id="29" w:name="_Toc241669004"/>
+      <w:bookmarkEnd w:id="28"/>
+      <w:bookmarkEnd w:id="29"/>
+    </w:p>
+    <w:p>
+      <w:pPr>
+        <w:pStyle w:val="ListParagraph"/>
+        <w:keepNext/>
+        <w:keepLines/>
+        <w:numPr>
+          <w:ilvl w:val="1"/>
+          <w:numId w:val="8"/>
+        </w:numPr>
+        <w:spacing w:before="40" w:after="0"/>
+        <w:contextualSpacing w:val="0"/>
+        <w:outlineLvl w:val="1"/>
+        <w:rPr>
+          <w:rFonts w:ascii="Times New Roman" w:eastAsiaTheme="majorEastAsia" w:hAnsi="Times New Roman" w:cs="Times New Roman"/>
+          <w:vanish/>
+          <w:color w:val="2E74B5" w:themeColor="accent1" w:themeShade="BF"/>
+          <w:sz w:val="26"/>
+          <w:szCs w:val="26"/>
+        </w:rPr>
+      </w:pPr>
+      <w:bookmarkStart w:id="30" w:name="_Toc241668978"/>
+      <w:bookmarkStart w:id="31" w:name="_Toc241669005"/>
+      <w:bookmarkEnd w:id="30"/>
+      <w:bookmarkEnd w:id="31"/>
     </w:p>
     <w:p>
       <w:pPr>
         <w:pStyle w:val="Heading2"/>
-        <w:rPr>
-          <w:lang w:val="vi-VN"/>
-        </w:rPr>
-      </w:pPr>
+        <w:numPr>
+          <w:ilvl w:val="1"/>
+          <w:numId w:val="8"/>
+        </w:numPr>
+        <w:rPr>
+          <w:rFonts w:ascii="Times New Roman" w:hAnsi="Times New Roman" w:cs="Times New Roman"/>
+          <w:lang w:val="vi-VN"/>
+        </w:rPr>
+      </w:pPr>
+      <w:bookmarkStart w:id="32" w:name="_Toc241669006"/>
       <w:proofErr w:type="spellStart"/>
       <w:r>
+        <w:rPr>
+          <w:rFonts w:ascii="Times New Roman" w:hAnsi="Times New Roman" w:cs="Times New Roman"/>
+        </w:rPr>
         <w:t>Bài</w:t>
       </w:r>
       <w:proofErr w:type="spellEnd"/>
       <w:r>
+        <w:rPr>
+          <w:rFonts w:ascii="Times New Roman" w:hAnsi="Times New Roman" w:cs="Times New Roman"/>
+        </w:rPr>
         <w:t xml:space="preserve"> </w:t>
       </w:r>
       <w:proofErr w:type="spellStart"/>
       <w:r>
+        <w:rPr>
+          <w:rFonts w:ascii="Times New Roman" w:hAnsi="Times New Roman" w:cs="Times New Roman"/>
+        </w:rPr>
         <w:t>thực</w:t>
       </w:r>
       <w:proofErr w:type="spellEnd"/>
       <w:r>
+        <w:rPr>
+          <w:rFonts w:ascii="Times New Roman" w:hAnsi="Times New Roman" w:cs="Times New Roman"/>
+        </w:rPr>
         <w:t xml:space="preserve"> </w:t>
       </w:r>
       <w:proofErr w:type="spellStart"/>
       <w:r>
+        <w:rPr>
+          <w:rFonts w:ascii="Times New Roman" w:hAnsi="Times New Roman" w:cs="Times New Roman"/>
+        </w:rPr>
         <w:t>hành</w:t>
       </w:r>
       <w:proofErr w:type="spellEnd"/>
       <w:r>
+        <w:rPr>
+          <w:rFonts w:ascii="Times New Roman" w:hAnsi="Times New Roman" w:cs="Times New Roman"/>
+        </w:rPr>
         <w:t xml:space="preserve"> </w:t>
       </w:r>
       <w:proofErr w:type="spellStart"/>
       <w:r>
+        <w:rPr>
+          <w:rFonts w:ascii="Times New Roman" w:hAnsi="Times New Roman" w:cs="Times New Roman"/>
+        </w:rPr>
         <w:t>số</w:t>
       </w:r>
       <w:proofErr w:type="spellEnd"/>
       <w:r>
+        <w:rPr>
+          <w:rFonts w:ascii="Times New Roman" w:hAnsi="Times New Roman" w:cs="Times New Roman"/>
+        </w:rPr>
         <w:t xml:space="preserve"> 2</w:t>
       </w:r>
-      <w:bookmarkEnd w:id="12"/>
-      <w:r>
+      <w:bookmarkEnd w:id="32"/>
+      <w:r>
+        <w:rPr>
+          <w:rFonts w:ascii="Times New Roman" w:hAnsi="Times New Roman" w:cs="Times New Roman"/>
+        </w:rPr>
         <w:t> </w:t>
       </w:r>
     </w:p>
@@ -2488,18 +3456,20 @@
       <w:pPr>
         <w:jc w:val="center"/>
         <w:rPr>
-          <w:lang w:val="vi-VN"/>
-        </w:rPr>
-      </w:pPr>
-      <w:r>
-        <w:rPr>
+          <w:rFonts w:ascii="Times New Roman" w:hAnsi="Times New Roman" w:cs="Times New Roman"/>
+          <w:lang w:val="vi-VN"/>
+        </w:rPr>
+      </w:pPr>
+      <w:r>
+        <w:rPr>
+          <w:rFonts w:ascii="Times New Roman" w:hAnsi="Times New Roman" w:cs="Times New Roman"/>
           <w:lang w:val="vi-VN"/>
         </w:rPr>
         <w:object w:dxaOrig="1520" w:dyaOrig="989" w14:anchorId="3C7A9037">
           <v:shape id="_x0000_i1040" type="#_x0000_t75" style="width:76.2pt;height:49.2pt" o:ole="">
-            <v:imagedata r:id="rId22" o:title=""/>
+            <v:imagedata r:id="rId23" o:title=""/>
           </v:shape>
-          <o:OLEObject Type="Embed" ProgID="Package" ShapeID="_x0000_i1040" DrawAspect="Icon" ObjectID="_1852281184" r:id="rId23"/>
+          <o:OLEObject Type="Embed" ProgID="Package" ShapeID="_x0000_i1040" DrawAspect="Icon" ObjectID="_1852281851" r:id="rId24"/>
         </w:object>
       </w:r>
     </w:p>
@@ -2507,38 +3477,44 @@
       <w:pPr>
         <w:pStyle w:val="Heading1"/>
         <w:rPr>
-          <w:lang w:val="vi-VN"/>
-        </w:rPr>
-      </w:pPr>
-      <w:bookmarkStart w:id="13" w:name="_Toc241667534"/>
-      <w:r>
-        <w:rPr>
+          <w:rFonts w:ascii="Times New Roman" w:hAnsi="Times New Roman" w:cs="Times New Roman"/>
+          <w:lang w:val="vi-VN"/>
+        </w:rPr>
+      </w:pPr>
+      <w:bookmarkStart w:id="33" w:name="_Toc241669007"/>
+      <w:r>
+        <w:rPr>
+          <w:rFonts w:ascii="Times New Roman" w:hAnsi="Times New Roman" w:cs="Times New Roman"/>
           <w:lang w:val="vi-VN"/>
         </w:rPr>
         <w:t xml:space="preserve">Lab </w:t>
       </w:r>
       <w:r>
         <w:rPr>
+          <w:rFonts w:ascii="Times New Roman" w:hAnsi="Times New Roman" w:cs="Times New Roman"/>
           <w:lang w:val="vi-VN"/>
         </w:rPr>
         <w:t xml:space="preserve">05: </w:t>
       </w:r>
       <w:r>
         <w:rPr>
+          <w:rFonts w:ascii="Times New Roman" w:hAnsi="Times New Roman" w:cs="Times New Roman"/>
           <w:lang w:val="vi-VN"/>
         </w:rPr>
         <w:t>Tạo, quản lý và chia sẽ nội dung số</w:t>
       </w:r>
-      <w:bookmarkEnd w:id="13"/>
-    </w:p>
-    <w:p>
-      <w:pPr>
-        <w:rPr>
-          <w:lang w:val="vi-VN"/>
-        </w:rPr>
-      </w:pPr>
-      <w:r>
-        <w:rPr>
+      <w:bookmarkEnd w:id="33"/>
+    </w:p>
+    <w:p>
+      <w:pPr>
+        <w:rPr>
+          <w:rFonts w:ascii="Times New Roman" w:hAnsi="Times New Roman" w:cs="Times New Roman"/>
+          <w:lang w:val="vi-VN"/>
+        </w:rPr>
+      </w:pPr>
+      <w:r>
+        <w:rPr>
+          <w:rFonts w:ascii="Times New Roman" w:hAnsi="Times New Roman" w:cs="Times New Roman"/>
           <w:lang w:val="vi-VN"/>
         </w:rPr>
         <w:t>https://github.com/trongb2605317-del/CT005_B2605317_Lab05/tree/main/lab05</w:t>
@@ -2874,6 +3850,723 @@
     </w:p>
   </w:footnote>
 </w:footnotes>
+</file>
+
+<file path=word/numbering.xml><?xml version="1.0" encoding="utf-8"?>
+<w:numbering xmlns:wpc="http://schemas.microsoft.com/office/word/2010/wordprocessingCanvas" xmlns:cx="http://schemas.microsoft.com/office/drawing/2014/chartex" xmlns:cx1="http://schemas.microsoft.com/office/drawing/2015/9/8/chartex" xmlns:cx2="http://schemas.microsoft.com/office/drawing/2015/10/21/chartex" xmlns:cx3="http://schemas.microsoft.com/office/drawing/2016/5/9/chartex" xmlns:cx4="http://schemas.microsoft.com/office/drawing/2016/5/10/chartex" xmlns:cx5="http://schemas.microsoft.com/office/drawing/2016/5/11/chartex" xmlns:cx6="http://schemas.microsoft.com/office/drawing/2016/5/12/chartex" xmlns:cx7="http://schemas.microsoft.com/office/drawing/2016/5/13/chartex" xmlns:cx8="http://schemas.microsoft.com/office/drawing/2016/5/14/chartex" xmlns:mc="http://schemas.openxmlformats.org/markup-compatibility/2006" xmlns:aink="http://schemas.microsoft.com/office/drawing/2016/ink" xmlns:am3d="http://schemas.microsoft.com/office/drawing/2017/model3d" xmlns:o="urn:schemas-microsoft-com:office:office" xmlns:oel="http://schemas.microsoft.com/office/2019/extlst" xmlns:r="http://schemas.openxmlformats.org/officeDocument/2006/relationships" xmlns:m="http://schemas.openxmlformats.org/officeDocument/2006/math" xmlns:v="urn:schemas-microsoft-com:vml" xmlns:wp14="http://schemas.microsoft.com/office/word/2010/wordprocessingDrawing" xmlns:wp="http://schemas.openxmlformats.org/drawingml/2006/wordprocessingDrawing" xmlns:w10="urn:schemas-microsoft-com:office:word" xmlns:w="http://schemas.openxmlformats.org/wordprocessingml/2006/main" xmlns:w14="http://schemas.microsoft.com/office/word/2010/wordml" xmlns:w15="http://schemas.microsoft.com/office/word/2012/wordml" xmlns:w16cex="http://schemas.microsoft.com/office/word/2018/wordml/cex" xmlns:w16cid="http://schemas.microsoft.com/office/word/2016/wordml/cid" xmlns:w16="http://schemas.microsoft.com/office/word/2018/wordml" xmlns:w16du="http://schemas.microsoft.com/office/word/2023/wordml/word16du" xmlns:w16sdtdh="http://schemas.microsoft.com/office/word/2020/wordml/sdtdatahash" xmlns:w16sdtfl="http://schemas.microsoft.com/office/word/2024/wordml/sdtformatlock" xmlns:w16se="http://schemas.microsoft.com/office/word/2015/wordml/symex" xmlns:wpg="http://schemas.microsoft.com/office/word/2010/wordprocessingGroup" xmlns:wpi="http://schemas.microsoft.com/office/word/2010/wordprocessingInk" xmlns:wne="http://schemas.microsoft.com/office/word/2006/wordml" xmlns:wps="http://schemas.microsoft.com/office/word/2010/wordprocessingShape" mc:Ignorable="w14 w15 w16se w16cid w16 w16cex w16sdtdh w16sdtfl w16du wp14">
+  <w:abstractNum w:abstractNumId="0" w15:restartNumberingAfterBreak="0">
+    <w:nsid w:val="15B44CD5"/>
+    <w:multiLevelType w:val="multilevel"/>
+    <w:tmpl w:val="0409001F"/>
+    <w:lvl w:ilvl="0">
+      <w:start w:val="1"/>
+      <w:numFmt w:val="decimal"/>
+      <w:lvlText w:val="%1."/>
+      <w:lvlJc w:val="left"/>
+      <w:pPr>
+        <w:ind w:left="360" w:hanging="360"/>
+      </w:pPr>
+    </w:lvl>
+    <w:lvl w:ilvl="1">
+      <w:start w:val="1"/>
+      <w:numFmt w:val="decimal"/>
+      <w:lvlText w:val="%1.%2."/>
+      <w:lvlJc w:val="left"/>
+      <w:pPr>
+        <w:ind w:left="792" w:hanging="432"/>
+      </w:pPr>
+    </w:lvl>
+    <w:lvl w:ilvl="2">
+      <w:start w:val="1"/>
+      <w:numFmt w:val="decimal"/>
+      <w:lvlText w:val="%1.%2.%3."/>
+      <w:lvlJc w:val="left"/>
+      <w:pPr>
+        <w:ind w:left="1224" w:hanging="504"/>
+      </w:pPr>
+    </w:lvl>
+    <w:lvl w:ilvl="3">
+      <w:start w:val="1"/>
+      <w:numFmt w:val="decimal"/>
+      <w:lvlText w:val="%1.%2.%3.%4."/>
+      <w:lvlJc w:val="left"/>
+      <w:pPr>
+        <w:ind w:left="1728" w:hanging="648"/>
+      </w:pPr>
+    </w:lvl>
+    <w:lvl w:ilvl="4">
+      <w:start w:val="1"/>
+      <w:numFmt w:val="decimal"/>
+      <w:lvlText w:val="%1.%2.%3.%4.%5."/>
+      <w:lvlJc w:val="left"/>
+      <w:pPr>
+        <w:ind w:left="2232" w:hanging="792"/>
+      </w:pPr>
+    </w:lvl>
+    <w:lvl w:ilvl="5">
+      <w:start w:val="1"/>
+      <w:numFmt w:val="decimal"/>
+      <w:lvlText w:val="%1.%2.%3.%4.%5.%6."/>
+      <w:lvlJc w:val="left"/>
+      <w:pPr>
+        <w:ind w:left="2736" w:hanging="936"/>
+      </w:pPr>
+    </w:lvl>
+    <w:lvl w:ilvl="6">
+      <w:start w:val="1"/>
+      <w:numFmt w:val="decimal"/>
+      <w:lvlText w:val="%1.%2.%3.%4.%5.%6.%7."/>
+      <w:lvlJc w:val="left"/>
+      <w:pPr>
+        <w:ind w:left="3240" w:hanging="1080"/>
+      </w:pPr>
+    </w:lvl>
+    <w:lvl w:ilvl="7">
+      <w:start w:val="1"/>
+      <w:numFmt w:val="decimal"/>
+      <w:lvlText w:val="%1.%2.%3.%4.%5.%6.%7.%8."/>
+      <w:lvlJc w:val="left"/>
+      <w:pPr>
+        <w:ind w:left="3744" w:hanging="1224"/>
+      </w:pPr>
+    </w:lvl>
+    <w:lvl w:ilvl="8">
+      <w:start w:val="1"/>
+      <w:numFmt w:val="decimal"/>
+      <w:lvlText w:val="%1.%2.%3.%4.%5.%6.%7.%8.%9."/>
+      <w:lvlJc w:val="left"/>
+      <w:pPr>
+        <w:ind w:left="4320" w:hanging="1440"/>
+      </w:pPr>
+    </w:lvl>
+  </w:abstractNum>
+  <w:abstractNum w:abstractNumId="1" w15:restartNumberingAfterBreak="0">
+    <w:nsid w:val="18AF1D7F"/>
+    <w:multiLevelType w:val="multilevel"/>
+    <w:tmpl w:val="0409001F"/>
+    <w:lvl w:ilvl="0">
+      <w:start w:val="1"/>
+      <w:numFmt w:val="decimal"/>
+      <w:lvlText w:val="%1."/>
+      <w:lvlJc w:val="left"/>
+      <w:pPr>
+        <w:ind w:left="360" w:hanging="360"/>
+      </w:pPr>
+    </w:lvl>
+    <w:lvl w:ilvl="1">
+      <w:start w:val="1"/>
+      <w:numFmt w:val="decimal"/>
+      <w:lvlText w:val="%1.%2."/>
+      <w:lvlJc w:val="left"/>
+      <w:pPr>
+        <w:ind w:left="792" w:hanging="432"/>
+      </w:pPr>
+    </w:lvl>
+    <w:lvl w:ilvl="2">
+      <w:start w:val="1"/>
+      <w:numFmt w:val="decimal"/>
+      <w:lvlText w:val="%1.%2.%3."/>
+      <w:lvlJc w:val="left"/>
+      <w:pPr>
+        <w:ind w:left="1224" w:hanging="504"/>
+      </w:pPr>
+    </w:lvl>
+    <w:lvl w:ilvl="3">
+      <w:start w:val="1"/>
+      <w:numFmt w:val="decimal"/>
+      <w:lvlText w:val="%1.%2.%3.%4."/>
+      <w:lvlJc w:val="left"/>
+      <w:pPr>
+        <w:ind w:left="1728" w:hanging="648"/>
+      </w:pPr>
+    </w:lvl>
+    <w:lvl w:ilvl="4">
+      <w:start w:val="1"/>
+      <w:numFmt w:val="decimal"/>
+      <w:lvlText w:val="%1.%2.%3.%4.%5."/>
+      <w:lvlJc w:val="left"/>
+      <w:pPr>
+        <w:ind w:left="2232" w:hanging="792"/>
+      </w:pPr>
+    </w:lvl>
+    <w:lvl w:ilvl="5">
+      <w:start w:val="1"/>
+      <w:numFmt w:val="decimal"/>
+      <w:lvlText w:val="%1.%2.%3.%4.%5.%6."/>
+      <w:lvlJc w:val="left"/>
+      <w:pPr>
+        <w:ind w:left="2736" w:hanging="936"/>
+      </w:pPr>
+    </w:lvl>
+    <w:lvl w:ilvl="6">
+      <w:start w:val="1"/>
+      <w:numFmt w:val="decimal"/>
+      <w:lvlText w:val="%1.%2.%3.%4.%5.%6.%7."/>
+      <w:lvlJc w:val="left"/>
+      <w:pPr>
+        <w:ind w:left="3240" w:hanging="1080"/>
+      </w:pPr>
+    </w:lvl>
+    <w:lvl w:ilvl="7">
+      <w:start w:val="1"/>
+      <w:numFmt w:val="decimal"/>
+      <w:lvlText w:val="%1.%2.%3.%4.%5.%6.%7.%8."/>
+      <w:lvlJc w:val="left"/>
+      <w:pPr>
+        <w:ind w:left="3744" w:hanging="1224"/>
+      </w:pPr>
+    </w:lvl>
+    <w:lvl w:ilvl="8">
+      <w:start w:val="1"/>
+      <w:numFmt w:val="decimal"/>
+      <w:lvlText w:val="%1.%2.%3.%4.%5.%6.%7.%8.%9."/>
+      <w:lvlJc w:val="left"/>
+      <w:pPr>
+        <w:ind w:left="4320" w:hanging="1440"/>
+      </w:pPr>
+    </w:lvl>
+  </w:abstractNum>
+  <w:abstractNum w:abstractNumId="2" w15:restartNumberingAfterBreak="0">
+    <w:nsid w:val="3D146847"/>
+    <w:multiLevelType w:val="multilevel"/>
+    <w:tmpl w:val="0409001F"/>
+    <w:lvl w:ilvl="0">
+      <w:start w:val="1"/>
+      <w:numFmt w:val="decimal"/>
+      <w:lvlText w:val="%1."/>
+      <w:lvlJc w:val="left"/>
+      <w:pPr>
+        <w:ind w:left="360" w:hanging="360"/>
+      </w:pPr>
+    </w:lvl>
+    <w:lvl w:ilvl="1">
+      <w:start w:val="1"/>
+      <w:numFmt w:val="decimal"/>
+      <w:lvlText w:val="%1.%2."/>
+      <w:lvlJc w:val="left"/>
+      <w:pPr>
+        <w:ind w:left="792" w:hanging="432"/>
+      </w:pPr>
+    </w:lvl>
+    <w:lvl w:ilvl="2">
+      <w:start w:val="1"/>
+      <w:numFmt w:val="decimal"/>
+      <w:lvlText w:val="%1.%2.%3."/>
+      <w:lvlJc w:val="left"/>
+      <w:pPr>
+        <w:ind w:left="1224" w:hanging="504"/>
+      </w:pPr>
+    </w:lvl>
+    <w:lvl w:ilvl="3">
+      <w:start w:val="1"/>
+      <w:numFmt w:val="decimal"/>
+      <w:lvlText w:val="%1.%2.%3.%4."/>
+      <w:lvlJc w:val="left"/>
+      <w:pPr>
+        <w:ind w:left="1728" w:hanging="648"/>
+      </w:pPr>
+    </w:lvl>
+    <w:lvl w:ilvl="4">
+      <w:start w:val="1"/>
+      <w:numFmt w:val="decimal"/>
+      <w:lvlText w:val="%1.%2.%3.%4.%5."/>
+      <w:lvlJc w:val="left"/>
+      <w:pPr>
+        <w:ind w:left="2232" w:hanging="792"/>
+      </w:pPr>
+    </w:lvl>
+    <w:lvl w:ilvl="5">
+      <w:start w:val="1"/>
+      <w:numFmt w:val="decimal"/>
+      <w:lvlText w:val="%1.%2.%3.%4.%5.%6."/>
+      <w:lvlJc w:val="left"/>
+      <w:pPr>
+        <w:ind w:left="2736" w:hanging="936"/>
+      </w:pPr>
+    </w:lvl>
+    <w:lvl w:ilvl="6">
+      <w:start w:val="1"/>
+      <w:numFmt w:val="decimal"/>
+      <w:lvlText w:val="%1.%2.%3.%4.%5.%6.%7."/>
+      <w:lvlJc w:val="left"/>
+      <w:pPr>
+        <w:ind w:left="3240" w:hanging="1080"/>
+      </w:pPr>
+    </w:lvl>
+    <w:lvl w:ilvl="7">
+      <w:start w:val="1"/>
+      <w:numFmt w:val="decimal"/>
+      <w:lvlText w:val="%1.%2.%3.%4.%5.%6.%7.%8."/>
+      <w:lvlJc w:val="left"/>
+      <w:pPr>
+        <w:ind w:left="3744" w:hanging="1224"/>
+      </w:pPr>
+    </w:lvl>
+    <w:lvl w:ilvl="8">
+      <w:start w:val="1"/>
+      <w:numFmt w:val="decimal"/>
+      <w:lvlText w:val="%1.%2.%3.%4.%5.%6.%7.%8.%9."/>
+      <w:lvlJc w:val="left"/>
+      <w:pPr>
+        <w:ind w:left="4320" w:hanging="1440"/>
+      </w:pPr>
+    </w:lvl>
+  </w:abstractNum>
+  <w:abstractNum w:abstractNumId="3" w15:restartNumberingAfterBreak="0">
+    <w:nsid w:val="4FF11945"/>
+    <w:multiLevelType w:val="multilevel"/>
+    <w:tmpl w:val="0409001F"/>
+    <w:lvl w:ilvl="0">
+      <w:start w:val="1"/>
+      <w:numFmt w:val="decimal"/>
+      <w:lvlText w:val="%1."/>
+      <w:lvlJc w:val="left"/>
+      <w:pPr>
+        <w:ind w:left="360" w:hanging="360"/>
+      </w:pPr>
+    </w:lvl>
+    <w:lvl w:ilvl="1">
+      <w:start w:val="1"/>
+      <w:numFmt w:val="decimal"/>
+      <w:lvlText w:val="%1.%2."/>
+      <w:lvlJc w:val="left"/>
+      <w:pPr>
+        <w:ind w:left="792" w:hanging="432"/>
+      </w:pPr>
+    </w:lvl>
+    <w:lvl w:ilvl="2">
+      <w:start w:val="1"/>
+      <w:numFmt w:val="decimal"/>
+      <w:lvlText w:val="%1.%2.%3."/>
+      <w:lvlJc w:val="left"/>
+      <w:pPr>
+        <w:ind w:left="1224" w:hanging="504"/>
+      </w:pPr>
+    </w:lvl>
+    <w:lvl w:ilvl="3">
+      <w:start w:val="1"/>
+      <w:numFmt w:val="decimal"/>
+      <w:lvlText w:val="%1.%2.%3.%4."/>
+      <w:lvlJc w:val="left"/>
+      <w:pPr>
+        <w:ind w:left="1728" w:hanging="648"/>
+      </w:pPr>
+    </w:lvl>
+    <w:lvl w:ilvl="4">
+      <w:start w:val="1"/>
+      <w:numFmt w:val="decimal"/>
+      <w:lvlText w:val="%1.%2.%3.%4.%5."/>
+      <w:lvlJc w:val="left"/>
+      <w:pPr>
+        <w:ind w:left="2232" w:hanging="792"/>
+      </w:pPr>
+    </w:lvl>
+    <w:lvl w:ilvl="5">
+      <w:start w:val="1"/>
+      <w:numFmt w:val="decimal"/>
+      <w:lvlText w:val="%1.%2.%3.%4.%5.%6."/>
+      <w:lvlJc w:val="left"/>
+      <w:pPr>
+        <w:ind w:left="2736" w:hanging="936"/>
+      </w:pPr>
+    </w:lvl>
+    <w:lvl w:ilvl="6">
+      <w:start w:val="1"/>
+      <w:numFmt w:val="decimal"/>
+      <w:lvlText w:val="%1.%2.%3.%4.%5.%6.%7."/>
+      <w:lvlJc w:val="left"/>
+      <w:pPr>
+        <w:ind w:left="3240" w:hanging="1080"/>
+      </w:pPr>
+    </w:lvl>
+    <w:lvl w:ilvl="7">
+      <w:start w:val="1"/>
+      <w:numFmt w:val="decimal"/>
+      <w:lvlText w:val="%1.%2.%3.%4.%5.%6.%7.%8."/>
+      <w:lvlJc w:val="left"/>
+      <w:pPr>
+        <w:ind w:left="3744" w:hanging="1224"/>
+      </w:pPr>
+    </w:lvl>
+    <w:lvl w:ilvl="8">
+      <w:start w:val="1"/>
+      <w:numFmt w:val="decimal"/>
+      <w:lvlText w:val="%1.%2.%3.%4.%5.%6.%7.%8.%9."/>
+      <w:lvlJc w:val="left"/>
+      <w:pPr>
+        <w:ind w:left="4320" w:hanging="1440"/>
+      </w:pPr>
+    </w:lvl>
+  </w:abstractNum>
+  <w:abstractNum w:abstractNumId="4" w15:restartNumberingAfterBreak="0">
+    <w:nsid w:val="649F7442"/>
+    <w:multiLevelType w:val="multilevel"/>
+    <w:tmpl w:val="0409001F"/>
+    <w:lvl w:ilvl="0">
+      <w:start w:val="1"/>
+      <w:numFmt w:val="decimal"/>
+      <w:lvlText w:val="%1."/>
+      <w:lvlJc w:val="left"/>
+      <w:pPr>
+        <w:ind w:left="360" w:hanging="360"/>
+      </w:pPr>
+    </w:lvl>
+    <w:lvl w:ilvl="1">
+      <w:start w:val="1"/>
+      <w:numFmt w:val="decimal"/>
+      <w:lvlText w:val="%1.%2."/>
+      <w:lvlJc w:val="left"/>
+      <w:pPr>
+        <w:ind w:left="792" w:hanging="432"/>
+      </w:pPr>
+    </w:lvl>
+    <w:lvl w:ilvl="2">
+      <w:start w:val="1"/>
+      <w:numFmt w:val="decimal"/>
+      <w:lvlText w:val="%1.%2.%3."/>
+      <w:lvlJc w:val="left"/>
+      <w:pPr>
+        <w:ind w:left="1224" w:hanging="504"/>
+      </w:pPr>
+    </w:lvl>
+    <w:lvl w:ilvl="3">
+      <w:start w:val="1"/>
+      <w:numFmt w:val="decimal"/>
+      <w:lvlText w:val="%1.%2.%3.%4."/>
+      <w:lvlJc w:val="left"/>
+      <w:pPr>
+        <w:ind w:left="1728" w:hanging="648"/>
+      </w:pPr>
+    </w:lvl>
+    <w:lvl w:ilvl="4">
+      <w:start w:val="1"/>
+      <w:numFmt w:val="decimal"/>
+      <w:lvlText w:val="%1.%2.%3.%4.%5."/>
+      <w:lvlJc w:val="left"/>
+      <w:pPr>
+        <w:ind w:left="2232" w:hanging="792"/>
+      </w:pPr>
+    </w:lvl>
+    <w:lvl w:ilvl="5">
+      <w:start w:val="1"/>
+      <w:numFmt w:val="decimal"/>
+      <w:lvlText w:val="%1.%2.%3.%4.%5.%6."/>
+      <w:lvlJc w:val="left"/>
+      <w:pPr>
+        <w:ind w:left="2736" w:hanging="936"/>
+      </w:pPr>
+    </w:lvl>
+    <w:lvl w:ilvl="6">
+      <w:start w:val="1"/>
+      <w:numFmt w:val="decimal"/>
+      <w:lvlText w:val="%1.%2.%3.%4.%5.%6.%7."/>
+      <w:lvlJc w:val="left"/>
+      <w:pPr>
+        <w:ind w:left="3240" w:hanging="1080"/>
+      </w:pPr>
+    </w:lvl>
+    <w:lvl w:ilvl="7">
+      <w:start w:val="1"/>
+      <w:numFmt w:val="decimal"/>
+      <w:lvlText w:val="%1.%2.%3.%4.%5.%6.%7.%8."/>
+      <w:lvlJc w:val="left"/>
+      <w:pPr>
+        <w:ind w:left="3744" w:hanging="1224"/>
+      </w:pPr>
+    </w:lvl>
+    <w:lvl w:ilvl="8">
+      <w:start w:val="1"/>
+      <w:numFmt w:val="decimal"/>
+      <w:lvlText w:val="%1.%2.%3.%4.%5.%6.%7.%8.%9."/>
+      <w:lvlJc w:val="left"/>
+      <w:pPr>
+        <w:ind w:left="4320" w:hanging="1440"/>
+      </w:pPr>
+    </w:lvl>
+  </w:abstractNum>
+  <w:abstractNum w:abstractNumId="5" w15:restartNumberingAfterBreak="0">
+    <w:nsid w:val="6CDC120C"/>
+    <w:multiLevelType w:val="multilevel"/>
+    <w:tmpl w:val="0409001F"/>
+    <w:lvl w:ilvl="0">
+      <w:start w:val="1"/>
+      <w:numFmt w:val="decimal"/>
+      <w:lvlText w:val="%1."/>
+      <w:lvlJc w:val="left"/>
+      <w:pPr>
+        <w:ind w:left="360" w:hanging="360"/>
+      </w:pPr>
+    </w:lvl>
+    <w:lvl w:ilvl="1">
+      <w:start w:val="1"/>
+      <w:numFmt w:val="decimal"/>
+      <w:lvlText w:val="%1.%2."/>
+      <w:lvlJc w:val="left"/>
+      <w:pPr>
+        <w:ind w:left="792" w:hanging="432"/>
+      </w:pPr>
+    </w:lvl>
+    <w:lvl w:ilvl="2">
+      <w:start w:val="1"/>
+      <w:numFmt w:val="decimal"/>
+      <w:lvlText w:val="%1.%2.%3."/>
+      <w:lvlJc w:val="left"/>
+      <w:pPr>
+        <w:ind w:left="1224" w:hanging="504"/>
+      </w:pPr>
+    </w:lvl>
+    <w:lvl w:ilvl="3">
+      <w:start w:val="1"/>
+      <w:numFmt w:val="decimal"/>
+      <w:lvlText w:val="%1.%2.%3.%4."/>
+      <w:lvlJc w:val="left"/>
+      <w:pPr>
+        <w:ind w:left="1728" w:hanging="648"/>
+      </w:pPr>
+    </w:lvl>
+    <w:lvl w:ilvl="4">
+      <w:start w:val="1"/>
+      <w:numFmt w:val="decimal"/>
+      <w:lvlText w:val="%1.%2.%3.%4.%5."/>
+      <w:lvlJc w:val="left"/>
+      <w:pPr>
+        <w:ind w:left="2232" w:hanging="792"/>
+      </w:pPr>
+    </w:lvl>
+    <w:lvl w:ilvl="5">
+      <w:start w:val="1"/>
+      <w:numFmt w:val="decimal"/>
+      <w:lvlText w:val="%1.%2.%3.%4.%5.%6."/>
+      <w:lvlJc w:val="left"/>
+      <w:pPr>
+        <w:ind w:left="2736" w:hanging="936"/>
+      </w:pPr>
+    </w:lvl>
+    <w:lvl w:ilvl="6">
+      <w:start w:val="1"/>
+      <w:numFmt w:val="decimal"/>
+      <w:lvlText w:val="%1.%2.%3.%4.%5.%6.%7."/>
+      <w:lvlJc w:val="left"/>
+      <w:pPr>
+        <w:ind w:left="3240" w:hanging="1080"/>
+      </w:pPr>
+    </w:lvl>
+    <w:lvl w:ilvl="7">
+      <w:start w:val="1"/>
+      <w:numFmt w:val="decimal"/>
+      <w:lvlText w:val="%1.%2.%3.%4.%5.%6.%7.%8."/>
+      <w:lvlJc w:val="left"/>
+      <w:pPr>
+        <w:ind w:left="3744" w:hanging="1224"/>
+      </w:pPr>
+    </w:lvl>
+    <w:lvl w:ilvl="8">
+      <w:start w:val="1"/>
+      <w:numFmt w:val="decimal"/>
+      <w:lvlText w:val="%1.%2.%3.%4.%5.%6.%7.%8.%9."/>
+      <w:lvlJc w:val="left"/>
+      <w:pPr>
+        <w:ind w:left="4320" w:hanging="1440"/>
+      </w:pPr>
+    </w:lvl>
+  </w:abstractNum>
+  <w:abstractNum w:abstractNumId="6" w15:restartNumberingAfterBreak="0">
+    <w:nsid w:val="719661C3"/>
+    <w:multiLevelType w:val="multilevel"/>
+    <w:tmpl w:val="0409001F"/>
+    <w:lvl w:ilvl="0">
+      <w:start w:val="1"/>
+      <w:numFmt w:val="decimal"/>
+      <w:lvlText w:val="%1."/>
+      <w:lvlJc w:val="left"/>
+      <w:pPr>
+        <w:ind w:left="360" w:hanging="360"/>
+      </w:pPr>
+    </w:lvl>
+    <w:lvl w:ilvl="1">
+      <w:start w:val="1"/>
+      <w:numFmt w:val="decimal"/>
+      <w:lvlText w:val="%1.%2."/>
+      <w:lvlJc w:val="left"/>
+      <w:pPr>
+        <w:ind w:left="792" w:hanging="432"/>
+      </w:pPr>
+    </w:lvl>
+    <w:lvl w:ilvl="2">
+      <w:start w:val="1"/>
+      <w:numFmt w:val="decimal"/>
+      <w:lvlText w:val="%1.%2.%3."/>
+      <w:lvlJc w:val="left"/>
+      <w:pPr>
+        <w:ind w:left="1224" w:hanging="504"/>
+      </w:pPr>
+    </w:lvl>
+    <w:lvl w:ilvl="3">
+      <w:start w:val="1"/>
+      <w:numFmt w:val="decimal"/>
+      <w:lvlText w:val="%1.%2.%3.%4."/>
+      <w:lvlJc w:val="left"/>
+      <w:pPr>
+        <w:ind w:left="1728" w:hanging="648"/>
+      </w:pPr>
+    </w:lvl>
+    <w:lvl w:ilvl="4">
+      <w:start w:val="1"/>
+      <w:numFmt w:val="decimal"/>
+      <w:lvlText w:val="%1.%2.%3.%4.%5."/>
+      <w:lvlJc w:val="left"/>
+      <w:pPr>
+        <w:ind w:left="2232" w:hanging="792"/>
+      </w:pPr>
+    </w:lvl>
+    <w:lvl w:ilvl="5">
+      <w:start w:val="1"/>
+      <w:numFmt w:val="decimal"/>
+      <w:lvlText w:val="%1.%2.%3.%4.%5.%6."/>
+      <w:lvlJc w:val="left"/>
+      <w:pPr>
+        <w:ind w:left="2736" w:hanging="936"/>
+      </w:pPr>
+    </w:lvl>
+    <w:lvl w:ilvl="6">
+      <w:start w:val="1"/>
+      <w:numFmt w:val="decimal"/>
+      <w:lvlText w:val="%1.%2.%3.%4.%5.%6.%7."/>
+      <w:lvlJc w:val="left"/>
+      <w:pPr>
+        <w:ind w:left="3240" w:hanging="1080"/>
+      </w:pPr>
+    </w:lvl>
+    <w:lvl w:ilvl="7">
+      <w:start w:val="1"/>
+      <w:numFmt w:val="decimal"/>
+      <w:lvlText w:val="%1.%2.%3.%4.%5.%6.%7.%8."/>
+      <w:lvlJc w:val="left"/>
+      <w:pPr>
+        <w:ind w:left="3744" w:hanging="1224"/>
+      </w:pPr>
+    </w:lvl>
+    <w:lvl w:ilvl="8">
+      <w:start w:val="1"/>
+      <w:numFmt w:val="decimal"/>
+      <w:lvlText w:val="%1.%2.%3.%4.%5.%6.%7.%8.%9."/>
+      <w:lvlJc w:val="left"/>
+      <w:pPr>
+        <w:ind w:left="4320" w:hanging="1440"/>
+      </w:pPr>
+    </w:lvl>
+  </w:abstractNum>
+  <w:abstractNum w:abstractNumId="7" w15:restartNumberingAfterBreak="0">
+    <w:nsid w:val="7F0D5A02"/>
+    <w:multiLevelType w:val="multilevel"/>
+    <w:tmpl w:val="0409001F"/>
+    <w:lvl w:ilvl="0">
+      <w:start w:val="1"/>
+      <w:numFmt w:val="decimal"/>
+      <w:lvlText w:val="%1."/>
+      <w:lvlJc w:val="left"/>
+      <w:pPr>
+        <w:ind w:left="360" w:hanging="360"/>
+      </w:pPr>
+    </w:lvl>
+    <w:lvl w:ilvl="1">
+      <w:start w:val="1"/>
+      <w:numFmt w:val="decimal"/>
+      <w:lvlText w:val="%1.%2."/>
+      <w:lvlJc w:val="left"/>
+      <w:pPr>
+        <w:ind w:left="792" w:hanging="432"/>
+      </w:pPr>
+    </w:lvl>
+    <w:lvl w:ilvl="2">
+      <w:start w:val="1"/>
+      <w:numFmt w:val="decimal"/>
+      <w:lvlText w:val="%1.%2.%3."/>
+      <w:lvlJc w:val="left"/>
+      <w:pPr>
+        <w:ind w:left="1224" w:hanging="504"/>
+      </w:pPr>
+    </w:lvl>
+    <w:lvl w:ilvl="3">
+      <w:start w:val="1"/>
+      <w:numFmt w:val="decimal"/>
+      <w:lvlText w:val="%1.%2.%3.%4."/>
+      <w:lvlJc w:val="left"/>
+      <w:pPr>
+        <w:ind w:left="1728" w:hanging="648"/>
+      </w:pPr>
+    </w:lvl>
+    <w:lvl w:ilvl="4">
+      <w:start w:val="1"/>
+      <w:numFmt w:val="decimal"/>
+      <w:lvlText w:val="%1.%2.%3.%4.%5."/>
+      <w:lvlJc w:val="left"/>
+      <w:pPr>
+        <w:ind w:left="2232" w:hanging="792"/>
+      </w:pPr>
+    </w:lvl>
+    <w:lvl w:ilvl="5">
+      <w:start w:val="1"/>
+      <w:numFmt w:val="decimal"/>
+      <w:lvlText w:val="%1.%2.%3.%4.%5.%6."/>
+      <w:lvlJc w:val="left"/>
+      <w:pPr>
+        <w:ind w:left="2736" w:hanging="936"/>
+      </w:pPr>
+    </w:lvl>
+    <w:lvl w:ilvl="6">
+      <w:start w:val="1"/>
+      <w:numFmt w:val="decimal"/>
+      <w:lvlText w:val="%1.%2.%3.%4.%5.%6.%7."/>
+      <w:lvlJc w:val="left"/>
+      <w:pPr>
+        <w:ind w:left="3240" w:hanging="1080"/>
+      </w:pPr>
+    </w:lvl>
+    <w:lvl w:ilvl="7">
+      <w:start w:val="1"/>
+      <w:numFmt w:val="decimal"/>
+      <w:lvlText w:val="%1.%2.%3.%4.%5.%6.%7.%8."/>
+      <w:lvlJc w:val="left"/>
+      <w:pPr>
+        <w:ind w:left="3744" w:hanging="1224"/>
+      </w:pPr>
+    </w:lvl>
+    <w:lvl w:ilvl="8">
+      <w:start w:val="1"/>
+      <w:numFmt w:val="decimal"/>
+      <w:lvlText w:val="%1.%2.%3.%4.%5.%6.%7.%8.%9."/>
+      <w:lvlJc w:val="left"/>
+      <w:pPr>
+        <w:ind w:left="4320" w:hanging="1440"/>
+      </w:pPr>
+    </w:lvl>
+  </w:abstractNum>
+  <w:num w:numId="1" w16cid:durableId="307174268">
+    <w:abstractNumId w:val="0"/>
+  </w:num>
+  <w:num w:numId="2" w16cid:durableId="172768621">
+    <w:abstractNumId w:val="3"/>
+  </w:num>
+  <w:num w:numId="3" w16cid:durableId="596401447">
+    <w:abstractNumId w:val="6"/>
+  </w:num>
+  <w:num w:numId="4" w16cid:durableId="1934821474">
+    <w:abstractNumId w:val="2"/>
+  </w:num>
+  <w:num w:numId="5" w16cid:durableId="1684551466">
+    <w:abstractNumId w:val="7"/>
+  </w:num>
+  <w:num w:numId="6" w16cid:durableId="1716346318">
+    <w:abstractNumId w:val="5"/>
+  </w:num>
+  <w:num w:numId="7" w16cid:durableId="1371222425">
+    <w:abstractNumId w:val="4"/>
+  </w:num>
+  <w:num w:numId="8" w16cid:durableId="41906143">
+    <w:abstractNumId w:val="1"/>
+  </w:num>
+</w:numbering>
 </file>
 
 <file path=word/styles.xml><?xml version="1.0" encoding="utf-8"?>
@@ -3480,6 +5173,17 @@
       <w:ind w:left="220"/>
     </w:pPr>
   </w:style>
+  <w:style w:type="paragraph" w:styleId="ListParagraph">
+    <w:name w:val="List Paragraph"/>
+    <w:basedOn w:val="Normal"/>
+    <w:uiPriority w:val="34"/>
+    <w:qFormat/>
+    <w:rsid w:val="0016024C"/>
+    <w:pPr>
+      <w:ind w:left="720"/>
+      <w:contextualSpacing/>
+    </w:pPr>
+  </w:style>
 </w:styles>
 </file>
 

</xml_diff>